<commit_message>
aggiunti indici in word
</commit_message>
<xml_diff>
--- a/Progetto_DB_Torneo.docx
+++ b/Progetto_DB_Torneo.docx
@@ -506,8 +506,10 @@
         <w:rPr>
           <w:rFonts w:ascii="Arial" w:eastAsia="Cambria" w:hAnsi="Arial" w:cs="Arial"/>
           <w:color w:val="343433"/>
-          <w:sz w:val="20"/>
-          <w:szCs w:val="20"/>
+          <w:kern w:val="0"/>
+          <w:sz w:val="20"/>
+          <w:szCs w:val="20"/>
+          <w14:ligatures w14:val="none"/>
         </w:rPr>
         <w:id w:val="-48758628"/>
         <w:docPartObj>
@@ -518,8 +520,6 @@
         <w:rPr>
           <w:rFonts w:eastAsia="Times New Roman"/>
           <w:color w:val="auto"/>
-          <w:kern w:val="0"/>
-          <w14:ligatures w14:val="none"/>
         </w:rPr>
       </w:sdtEndPr>
       <w:sdtContent>
@@ -1596,23 +1596,121 @@
           <w:sz w:val="20"/>
           <w:szCs w:val="20"/>
         </w:rPr>
-        <w:t>presenta una ridondanza. Questo pu</w:t>
-      </w:r>
-      <w:r>
-        <w:rPr>
-          <w:rFonts w:ascii="Arial" w:hAnsi="Arial" w:cs="Arial"/>
-          <w:sz w:val="20"/>
-          <w:szCs w:val="20"/>
-        </w:rPr>
-        <w:t>ò</w:t>
-      </w:r>
-      <w:r>
-        <w:rPr>
-          <w:rFonts w:ascii="Arial" w:hAnsi="Arial" w:cs="Arial"/>
-          <w:sz w:val="20"/>
-          <w:szCs w:val="20"/>
-        </w:rPr>
-        <w:t xml:space="preserve"> essere infatti ottenuto</w:t>
+        <w:t xml:space="preserve">presenta una ridondanza. Questo può essere infatti ottenuto contando il </w:t>
+      </w:r>
+      <w:r>
+        <w:rPr>
+          <w:rFonts w:ascii="Arial" w:hAnsi="Arial" w:cs="Arial"/>
+          <w:sz w:val="20"/>
+          <w:szCs w:val="20"/>
+        </w:rPr>
+        <w:t>numero di carte in quel mazzo</w:t>
+      </w:r>
+      <w:r>
+        <w:rPr>
+          <w:rFonts w:ascii="Arial" w:hAnsi="Arial" w:cs="Arial"/>
+          <w:sz w:val="20"/>
+          <w:szCs w:val="20"/>
+        </w:rPr>
+        <w:t xml:space="preserve"> tramite </w:t>
+      </w:r>
+      <w:r>
+        <w:rPr>
+          <w:rFonts w:ascii="Arial" w:hAnsi="Arial" w:cs="Arial"/>
+          <w:sz w:val="20"/>
+          <w:szCs w:val="20"/>
+        </w:rPr>
+        <w:t xml:space="preserve">l’attributo QUANTITÀ della </w:t>
+      </w:r>
+      <w:r>
+        <w:rPr>
+          <w:rFonts w:ascii="Arial" w:hAnsi="Arial" w:cs="Arial"/>
+          <w:sz w:val="20"/>
+          <w:szCs w:val="20"/>
+        </w:rPr>
+        <w:t xml:space="preserve">relazione </w:t>
+      </w:r>
+      <w:r>
+        <w:rPr>
+          <w:rFonts w:ascii="Arial" w:hAnsi="Arial" w:cs="Arial"/>
+          <w:sz w:val="20"/>
+          <w:szCs w:val="20"/>
+        </w:rPr>
+        <w:t>PART_OF</w:t>
+      </w:r>
+      <w:r>
+        <w:rPr>
+          <w:rFonts w:ascii="Arial" w:hAnsi="Arial" w:cs="Arial"/>
+          <w:sz w:val="20"/>
+          <w:szCs w:val="20"/>
+        </w:rPr>
+        <w:t>.</w:t>
+      </w:r>
+    </w:p>
+    <w:p>
+      <w:pPr>
+        <w:pStyle w:val="p2"/>
+        <w:rPr>
+          <w:rFonts w:ascii="Arial" w:hAnsi="Arial" w:cs="Arial"/>
+          <w:sz w:val="20"/>
+          <w:szCs w:val="20"/>
+        </w:rPr>
+      </w:pPr>
+      <w:r>
+        <w:rPr>
+          <w:rFonts w:ascii="Arial" w:hAnsi="Arial" w:cs="Arial"/>
+          <w:sz w:val="20"/>
+          <w:szCs w:val="20"/>
+        </w:rPr>
+        <w:t xml:space="preserve">Questo attributo viene modificato ogni volta che </w:t>
+      </w:r>
+      <w:r>
+        <w:rPr>
+          <w:rFonts w:ascii="Arial" w:hAnsi="Arial" w:cs="Arial"/>
+          <w:sz w:val="20"/>
+          <w:szCs w:val="20"/>
+        </w:rPr>
+        <w:t xml:space="preserve">viene aggiunta una carta </w:t>
+      </w:r>
+      <w:r>
+        <w:rPr>
+          <w:rFonts w:ascii="Arial" w:hAnsi="Arial" w:cs="Arial"/>
+          <w:sz w:val="20"/>
+          <w:szCs w:val="20"/>
+        </w:rPr>
+        <w:t xml:space="preserve">in un </w:t>
+      </w:r>
+      <w:r>
+        <w:rPr>
+          <w:rFonts w:ascii="Arial" w:hAnsi="Arial" w:cs="Arial"/>
+          <w:sz w:val="20"/>
+          <w:szCs w:val="20"/>
+        </w:rPr>
+        <w:t xml:space="preserve">mazzo, che sia nuova oppure una carta inserita in precedenza </w:t>
+      </w:r>
+      <w:r>
+        <w:rPr>
+          <w:rFonts w:ascii="Arial" w:hAnsi="Arial" w:cs="Arial"/>
+          <w:sz w:val="20"/>
+          <w:szCs w:val="20"/>
+        </w:rPr>
+        <w:t xml:space="preserve">(circa </w:t>
+      </w:r>
+      <w:r>
+        <w:rPr>
+          <w:rFonts w:ascii="Arial" w:hAnsi="Arial" w:cs="Arial"/>
+          <w:sz w:val="20"/>
+          <w:szCs w:val="20"/>
+        </w:rPr>
+        <w:t>10</w:t>
+      </w:r>
+      <w:r>
+        <w:rPr>
+          <w:rFonts w:ascii="Arial" w:hAnsi="Arial" w:cs="Arial"/>
+          <w:sz w:val="20"/>
+          <w:szCs w:val="20"/>
+        </w:rPr>
+        <w:t>00</w:t>
       </w:r>
       <w:r>
         <w:rPr>
@@ -1628,55 +1726,119 @@
           <w:sz w:val="20"/>
           <w:szCs w:val="20"/>
         </w:rPr>
-        <w:t xml:space="preserve">contando il </w:t>
-      </w:r>
-      <w:r>
-        <w:rPr>
-          <w:rFonts w:ascii="Arial" w:hAnsi="Arial" w:cs="Arial"/>
-          <w:sz w:val="20"/>
-          <w:szCs w:val="20"/>
-        </w:rPr>
-        <w:t>numero di carte in quel mazzo</w:t>
-      </w:r>
-      <w:r>
-        <w:rPr>
-          <w:rFonts w:ascii="Arial" w:hAnsi="Arial" w:cs="Arial"/>
-          <w:sz w:val="20"/>
-          <w:szCs w:val="20"/>
-        </w:rPr>
-        <w:t xml:space="preserve"> tramite </w:t>
-      </w:r>
-      <w:r>
-        <w:rPr>
-          <w:rFonts w:ascii="Arial" w:hAnsi="Arial" w:cs="Arial"/>
-          <w:sz w:val="20"/>
-          <w:szCs w:val="20"/>
-        </w:rPr>
-        <w:t xml:space="preserve">l’attributo QUANTITÀ della </w:t>
-      </w:r>
-      <w:r>
-        <w:rPr>
-          <w:rFonts w:ascii="Arial" w:hAnsi="Arial" w:cs="Arial"/>
-          <w:sz w:val="20"/>
-          <w:szCs w:val="20"/>
-        </w:rPr>
-        <w:t xml:space="preserve">relazione </w:t>
-      </w:r>
-      <w:r>
-        <w:rPr>
-          <w:rFonts w:ascii="Arial" w:hAnsi="Arial" w:cs="Arial"/>
-          <w:sz w:val="20"/>
-          <w:szCs w:val="20"/>
-        </w:rPr>
-        <w:t>PART_OF</w:t>
-      </w:r>
-      <w:r>
-        <w:rPr>
-          <w:rFonts w:ascii="Arial" w:hAnsi="Arial" w:cs="Arial"/>
-          <w:sz w:val="20"/>
-          <w:szCs w:val="20"/>
-        </w:rPr>
-        <w:t>.</w:t>
+        <w:t>carte</w:t>
+      </w:r>
+      <w:r>
+        <w:rPr>
+          <w:rFonts w:ascii="Arial" w:hAnsi="Arial" w:cs="Arial"/>
+          <w:sz w:val="20"/>
+          <w:szCs w:val="20"/>
+        </w:rPr>
+        <w:t xml:space="preserve"> </w:t>
+      </w:r>
+      <w:r>
+        <w:rPr>
+          <w:rFonts w:ascii="Arial" w:hAnsi="Arial" w:cs="Arial"/>
+          <w:sz w:val="20"/>
+          <w:szCs w:val="20"/>
+        </w:rPr>
+        <w:t xml:space="preserve">aggiunte </w:t>
+      </w:r>
+      <w:r>
+        <w:rPr>
+          <w:rFonts w:ascii="Arial" w:hAnsi="Arial" w:cs="Arial"/>
+          <w:sz w:val="20"/>
+          <w:szCs w:val="20"/>
+        </w:rPr>
+        <w:t>al giorno tra tutti i</w:t>
+      </w:r>
+      <w:r>
+        <w:rPr>
+          <w:rFonts w:ascii="Arial" w:hAnsi="Arial" w:cs="Arial"/>
+          <w:sz w:val="20"/>
+          <w:szCs w:val="20"/>
+        </w:rPr>
+        <w:t xml:space="preserve"> mazzi</w:t>
+      </w:r>
+      <w:r>
+        <w:rPr>
+          <w:rFonts w:ascii="Arial" w:hAnsi="Arial" w:cs="Arial"/>
+          <w:sz w:val="20"/>
+          <w:szCs w:val="20"/>
+        </w:rPr>
+        <w:t xml:space="preserve">) e viene visualizzato </w:t>
+      </w:r>
+      <w:r>
+        <w:rPr>
+          <w:rFonts w:ascii="Arial" w:hAnsi="Arial" w:cs="Arial"/>
+          <w:sz w:val="20"/>
+          <w:szCs w:val="20"/>
+        </w:rPr>
+        <w:t>prima di ogni</w:t>
+      </w:r>
+      <w:r>
+        <w:rPr>
+          <w:rFonts w:ascii="Arial" w:hAnsi="Arial" w:cs="Arial"/>
+          <w:sz w:val="20"/>
+          <w:szCs w:val="20"/>
+        </w:rPr>
+        <w:t xml:space="preserve"> </w:t>
+      </w:r>
+      <w:r>
+        <w:rPr>
+          <w:rFonts w:ascii="Arial" w:hAnsi="Arial" w:cs="Arial"/>
+          <w:sz w:val="20"/>
+          <w:szCs w:val="20"/>
+        </w:rPr>
+        <w:t>nuova partita</w:t>
+      </w:r>
+      <w:r>
+        <w:rPr>
+          <w:rFonts w:ascii="Arial" w:hAnsi="Arial" w:cs="Arial"/>
+          <w:sz w:val="20"/>
+          <w:szCs w:val="20"/>
+        </w:rPr>
+        <w:t xml:space="preserve"> per monitorare il numero </w:t>
+      </w:r>
+      <w:r>
+        <w:rPr>
+          <w:rFonts w:ascii="Arial" w:hAnsi="Arial" w:cs="Arial"/>
+          <w:sz w:val="20"/>
+          <w:szCs w:val="20"/>
+        </w:rPr>
+        <w:t xml:space="preserve">totale </w:t>
+      </w:r>
+      <w:r>
+        <w:rPr>
+          <w:rFonts w:ascii="Arial" w:hAnsi="Arial" w:cs="Arial"/>
+          <w:sz w:val="20"/>
+          <w:szCs w:val="20"/>
+        </w:rPr>
+        <w:t xml:space="preserve">di </w:t>
+      </w:r>
+      <w:r>
+        <w:rPr>
+          <w:rFonts w:ascii="Arial" w:hAnsi="Arial" w:cs="Arial"/>
+          <w:sz w:val="20"/>
+          <w:szCs w:val="20"/>
+        </w:rPr>
+        <w:t xml:space="preserve">carte </w:t>
+      </w:r>
+      <w:r>
+        <w:rPr>
+          <w:rFonts w:ascii="Arial" w:hAnsi="Arial" w:cs="Arial"/>
+          <w:sz w:val="20"/>
+          <w:szCs w:val="20"/>
+        </w:rPr>
+        <w:t>nel mazzo, cioè 60 carte</w:t>
+      </w:r>
+      <w:r>
+        <w:rPr>
+          <w:rFonts w:ascii="Arial" w:hAnsi="Arial" w:cs="Arial"/>
+          <w:sz w:val="20"/>
+          <w:szCs w:val="20"/>
+        </w:rPr>
+        <w:t xml:space="preserve">. </w:t>
       </w:r>
     </w:p>
     <w:p>
@@ -1694,51 +1856,75 @@
           <w:sz w:val="20"/>
           <w:szCs w:val="20"/>
         </w:rPr>
-        <w:t xml:space="preserve">Questo attributo viene modificato ogni volta che </w:t>
-      </w:r>
-      <w:r>
-        <w:rPr>
-          <w:rFonts w:ascii="Arial" w:hAnsi="Arial" w:cs="Arial"/>
-          <w:sz w:val="20"/>
-          <w:szCs w:val="20"/>
-        </w:rPr>
-        <w:t xml:space="preserve">viene aggiunta una carta </w:t>
-      </w:r>
-      <w:r>
-        <w:rPr>
-          <w:rFonts w:ascii="Arial" w:hAnsi="Arial" w:cs="Arial"/>
-          <w:sz w:val="20"/>
-          <w:szCs w:val="20"/>
-        </w:rPr>
-        <w:t xml:space="preserve">in un </w:t>
-      </w:r>
-      <w:r>
-        <w:rPr>
-          <w:rFonts w:ascii="Arial" w:hAnsi="Arial" w:cs="Arial"/>
-          <w:sz w:val="20"/>
-          <w:szCs w:val="20"/>
-        </w:rPr>
-        <w:t xml:space="preserve">mazzo, che sia nuova oppure una carta inserita in precedenza </w:t>
-      </w:r>
-      <w:r>
-        <w:rPr>
-          <w:rFonts w:ascii="Arial" w:hAnsi="Arial" w:cs="Arial"/>
-          <w:sz w:val="20"/>
-          <w:szCs w:val="20"/>
-        </w:rPr>
-        <w:t xml:space="preserve">(circa </w:t>
-      </w:r>
-      <w:r>
-        <w:rPr>
-          <w:rFonts w:ascii="Arial" w:hAnsi="Arial" w:cs="Arial"/>
-          <w:sz w:val="20"/>
-          <w:szCs w:val="20"/>
-        </w:rPr>
-        <w:t>10</w:t>
-      </w:r>
-      <w:r>
-        <w:rPr>
-          <w:rFonts w:ascii="Arial" w:hAnsi="Arial" w:cs="Arial"/>
+        <w:t>Questo si riassume nelle</w:t>
+      </w:r>
+      <w:r>
+        <w:rPr>
+          <w:rFonts w:ascii="Arial" w:hAnsi="Arial" w:cs="Arial"/>
+          <w:sz w:val="20"/>
+          <w:szCs w:val="20"/>
+        </w:rPr>
+        <w:t xml:space="preserve"> </w:t>
+      </w:r>
+      <w:r>
+        <w:rPr>
+          <w:rFonts w:ascii="Arial" w:hAnsi="Arial" w:cs="Arial"/>
+          <w:sz w:val="20"/>
+          <w:szCs w:val="20"/>
+        </w:rPr>
+        <w:t>seguenti due operazioni:</w:t>
+      </w:r>
+    </w:p>
+    <w:p>
+      <w:pPr>
+        <w:rPr>
+          <w:rFonts w:ascii="Arial" w:hAnsi="Arial" w:cs="Arial"/>
+          <w:color w:val="272827"/>
+          <w:sz w:val="20"/>
+          <w:szCs w:val="20"/>
+        </w:rPr>
+      </w:pPr>
+    </w:p>
+    <w:p>
+      <w:pPr>
+        <w:rPr>
+          <w:rFonts w:ascii="Arial" w:hAnsi="Arial" w:cs="Arial"/>
+          <w:color w:val="272827"/>
+          <w:sz w:val="20"/>
+          <w:szCs w:val="20"/>
+        </w:rPr>
+      </w:pPr>
+      <w:r>
+        <w:rPr>
+          <w:rFonts w:ascii="Arial" w:hAnsi="Arial" w:cs="Arial"/>
+          <w:color w:val="272827"/>
+          <w:sz w:val="20"/>
+          <w:szCs w:val="20"/>
+        </w:rPr>
+        <w:t>• Operazione 1 (</w:t>
+      </w:r>
+      <w:r>
+        <w:rPr>
+          <w:rFonts w:ascii="Arial" w:hAnsi="Arial" w:cs="Arial"/>
+          <w:color w:val="272827"/>
+          <w:sz w:val="20"/>
+          <w:szCs w:val="20"/>
+        </w:rPr>
+        <w:t>1</w:t>
+      </w:r>
+      <w:r>
+        <w:rPr>
+          <w:rFonts w:ascii="Arial" w:hAnsi="Arial" w:cs="Arial"/>
+          <w:color w:val="272827"/>
+          <w:sz w:val="20"/>
+          <w:szCs w:val="20"/>
+        </w:rPr>
+        <w:t>0</w:t>
+      </w:r>
+      <w:r>
+        <w:rPr>
+          <w:rFonts w:ascii="Arial" w:hAnsi="Arial" w:cs="Arial"/>
+          <w:color w:val="272827"/>
           <w:sz w:val="20"/>
           <w:szCs w:val="20"/>
         </w:rPr>
@@ -1747,232 +1933,6 @@
       <w:r>
         <w:rPr>
           <w:rFonts w:ascii="Arial" w:hAnsi="Arial" w:cs="Arial"/>
-          <w:sz w:val="20"/>
-          <w:szCs w:val="20"/>
-        </w:rPr>
-        <w:t xml:space="preserve"> </w:t>
-      </w:r>
-      <w:r>
-        <w:rPr>
-          <w:rFonts w:ascii="Arial" w:hAnsi="Arial" w:cs="Arial"/>
-          <w:sz w:val="20"/>
-          <w:szCs w:val="20"/>
-        </w:rPr>
-        <w:t>carte</w:t>
-      </w:r>
-      <w:r>
-        <w:rPr>
-          <w:rFonts w:ascii="Arial" w:hAnsi="Arial" w:cs="Arial"/>
-          <w:sz w:val="20"/>
-          <w:szCs w:val="20"/>
-        </w:rPr>
-        <w:t xml:space="preserve"> </w:t>
-      </w:r>
-      <w:r>
-        <w:rPr>
-          <w:rFonts w:ascii="Arial" w:hAnsi="Arial" w:cs="Arial"/>
-          <w:sz w:val="20"/>
-          <w:szCs w:val="20"/>
-        </w:rPr>
-        <w:t xml:space="preserve">aggiunte </w:t>
-      </w:r>
-      <w:r>
-        <w:rPr>
-          <w:rFonts w:ascii="Arial" w:hAnsi="Arial" w:cs="Arial"/>
-          <w:sz w:val="20"/>
-          <w:szCs w:val="20"/>
-        </w:rPr>
-        <w:t>al giorno tra tutti i</w:t>
-      </w:r>
-      <w:r>
-        <w:rPr>
-          <w:rFonts w:ascii="Arial" w:hAnsi="Arial" w:cs="Arial"/>
-          <w:sz w:val="20"/>
-          <w:szCs w:val="20"/>
-        </w:rPr>
-        <w:t xml:space="preserve"> mazzi</w:t>
-      </w:r>
-      <w:r>
-        <w:rPr>
-          <w:rFonts w:ascii="Arial" w:hAnsi="Arial" w:cs="Arial"/>
-          <w:sz w:val="20"/>
-          <w:szCs w:val="20"/>
-        </w:rPr>
-        <w:t>) e viene visualizzato</w:t>
-      </w:r>
-      <w:r>
-        <w:rPr>
-          <w:rFonts w:ascii="Arial" w:hAnsi="Arial" w:cs="Arial"/>
-          <w:sz w:val="20"/>
-          <w:szCs w:val="20"/>
-        </w:rPr>
-        <w:t xml:space="preserve"> </w:t>
-      </w:r>
-      <w:r>
-        <w:rPr>
-          <w:rFonts w:ascii="Arial" w:hAnsi="Arial" w:cs="Arial"/>
-          <w:sz w:val="20"/>
-          <w:szCs w:val="20"/>
-        </w:rPr>
-        <w:t>prima di ogni</w:t>
-      </w:r>
-      <w:r>
-        <w:rPr>
-          <w:rFonts w:ascii="Arial" w:hAnsi="Arial" w:cs="Arial"/>
-          <w:sz w:val="20"/>
-          <w:szCs w:val="20"/>
-        </w:rPr>
-        <w:t xml:space="preserve"> </w:t>
-      </w:r>
-      <w:r>
-        <w:rPr>
-          <w:rFonts w:ascii="Arial" w:hAnsi="Arial" w:cs="Arial"/>
-          <w:sz w:val="20"/>
-          <w:szCs w:val="20"/>
-        </w:rPr>
-        <w:t>nuova partita</w:t>
-      </w:r>
-      <w:r>
-        <w:rPr>
-          <w:rFonts w:ascii="Arial" w:hAnsi="Arial" w:cs="Arial"/>
-          <w:sz w:val="20"/>
-          <w:szCs w:val="20"/>
-        </w:rPr>
-        <w:t xml:space="preserve"> per monitorare il numero </w:t>
-      </w:r>
-      <w:r>
-        <w:rPr>
-          <w:rFonts w:ascii="Arial" w:hAnsi="Arial" w:cs="Arial"/>
-          <w:sz w:val="20"/>
-          <w:szCs w:val="20"/>
-        </w:rPr>
-        <w:t xml:space="preserve">totale </w:t>
-      </w:r>
-      <w:r>
-        <w:rPr>
-          <w:rFonts w:ascii="Arial" w:hAnsi="Arial" w:cs="Arial"/>
-          <w:sz w:val="20"/>
-          <w:szCs w:val="20"/>
-        </w:rPr>
-        <w:t xml:space="preserve">di </w:t>
-      </w:r>
-      <w:r>
-        <w:rPr>
-          <w:rFonts w:ascii="Arial" w:hAnsi="Arial" w:cs="Arial"/>
-          <w:sz w:val="20"/>
-          <w:szCs w:val="20"/>
-        </w:rPr>
-        <w:t xml:space="preserve">carte </w:t>
-      </w:r>
-      <w:r>
-        <w:rPr>
-          <w:rFonts w:ascii="Arial" w:hAnsi="Arial" w:cs="Arial"/>
-          <w:sz w:val="20"/>
-          <w:szCs w:val="20"/>
-        </w:rPr>
-        <w:t>nel mazzo, cioè 60 carte</w:t>
-      </w:r>
-      <w:r>
-        <w:rPr>
-          <w:rFonts w:ascii="Arial" w:hAnsi="Arial" w:cs="Arial"/>
-          <w:sz w:val="20"/>
-          <w:szCs w:val="20"/>
-        </w:rPr>
-        <w:t xml:space="preserve">. </w:t>
-      </w:r>
-    </w:p>
-    <w:p>
-      <w:pPr>
-        <w:pStyle w:val="p2"/>
-        <w:rPr>
-          <w:rFonts w:ascii="Arial" w:hAnsi="Arial" w:cs="Arial"/>
-          <w:sz w:val="20"/>
-          <w:szCs w:val="20"/>
-        </w:rPr>
-      </w:pPr>
-      <w:r>
-        <w:rPr>
-          <w:rFonts w:ascii="Arial" w:hAnsi="Arial" w:cs="Arial"/>
-          <w:sz w:val="20"/>
-          <w:szCs w:val="20"/>
-        </w:rPr>
-        <w:t>Questo si riassume nelle</w:t>
-      </w:r>
-      <w:r>
-        <w:rPr>
-          <w:rFonts w:ascii="Arial" w:hAnsi="Arial" w:cs="Arial"/>
-          <w:sz w:val="20"/>
-          <w:szCs w:val="20"/>
-        </w:rPr>
-        <w:t xml:space="preserve"> </w:t>
-      </w:r>
-      <w:r>
-        <w:rPr>
-          <w:rFonts w:ascii="Arial" w:hAnsi="Arial" w:cs="Arial"/>
-          <w:sz w:val="20"/>
-          <w:szCs w:val="20"/>
-        </w:rPr>
-        <w:t>seguenti due operazioni:</w:t>
-      </w:r>
-    </w:p>
-    <w:p>
-      <w:pPr>
-        <w:rPr>
-          <w:rFonts w:ascii="Arial" w:hAnsi="Arial" w:cs="Arial"/>
-          <w:color w:val="272827"/>
-          <w:sz w:val="20"/>
-          <w:szCs w:val="20"/>
-        </w:rPr>
-      </w:pPr>
-    </w:p>
-    <w:p>
-      <w:pPr>
-        <w:rPr>
-          <w:rFonts w:ascii="Arial" w:hAnsi="Arial" w:cs="Arial"/>
-          <w:color w:val="272827"/>
-          <w:sz w:val="20"/>
-          <w:szCs w:val="20"/>
-        </w:rPr>
-      </w:pPr>
-      <w:r>
-        <w:rPr>
-          <w:rFonts w:ascii="Arial" w:hAnsi="Arial" w:cs="Arial"/>
-          <w:color w:val="272827"/>
-          <w:sz w:val="20"/>
-          <w:szCs w:val="20"/>
-        </w:rPr>
-        <w:t>• Operazione 1 (</w:t>
-      </w:r>
-      <w:r>
-        <w:rPr>
-          <w:rFonts w:ascii="Arial" w:hAnsi="Arial" w:cs="Arial"/>
-          <w:color w:val="272827"/>
-          <w:sz w:val="20"/>
-          <w:szCs w:val="20"/>
-        </w:rPr>
-        <w:t>1</w:t>
-      </w:r>
-      <w:r>
-        <w:rPr>
-          <w:rFonts w:ascii="Arial" w:hAnsi="Arial" w:cs="Arial"/>
-          <w:color w:val="272827"/>
-          <w:sz w:val="20"/>
-          <w:szCs w:val="20"/>
-        </w:rPr>
-        <w:t>0</w:t>
-      </w:r>
-      <w:r>
-        <w:rPr>
-          <w:rFonts w:ascii="Arial" w:hAnsi="Arial" w:cs="Arial"/>
-          <w:color w:val="272827"/>
-          <w:sz w:val="20"/>
-          <w:szCs w:val="20"/>
-        </w:rPr>
-        <w:t>00</w:t>
-      </w:r>
-      <w:r>
-        <w:rPr>
-          <w:rFonts w:ascii="Arial" w:hAnsi="Arial" w:cs="Arial"/>
           <w:color w:val="272827"/>
           <w:sz w:val="20"/>
           <w:szCs w:val="20"/>
@@ -1986,16 +1946,7 @@
           <w:sz w:val="20"/>
           <w:szCs w:val="20"/>
         </w:rPr>
-        <w:t>inserire o rimuovere una carta all’interno del mazzo</w:t>
-      </w:r>
-      <w:r>
-        <w:rPr>
-          <w:rFonts w:ascii="Arial" w:hAnsi="Arial" w:cs="Arial"/>
-          <w:color w:val="272827"/>
-          <w:sz w:val="20"/>
-          <w:szCs w:val="20"/>
-        </w:rPr>
-        <w:t xml:space="preserve"> </w:t>
+        <w:t xml:space="preserve">inserire o rimuovere una carta all’interno del mazzo </w:t>
       </w:r>
     </w:p>
     <w:p>
@@ -5122,16 +5073,7 @@
           <w:sz w:val="20"/>
           <w:szCs w:val="20"/>
         </w:rPr>
-        <w:t>L</w:t>
-      </w:r>
-      <w:r>
-        <w:rPr>
-          <w:rFonts w:ascii="Arial" w:hAnsi="Arial" w:cs="Arial"/>
-          <w:color w:val="000000"/>
-          <w:sz w:val="20"/>
-          <w:szCs w:val="20"/>
-        </w:rPr>
-        <w:t>a chiave primaria</w:t>
+        <w:t>La chiave primaria</w:t>
       </w:r>
       <w:r>
         <w:rPr>
@@ -9352,6 +9294,1179 @@
         <w:t>)</w:t>
       </w:r>
     </w:p>
+    <w:p>
+      <w:pPr>
+        <w:spacing w:before="100" w:beforeAutospacing="1" w:after="100" w:afterAutospacing="1"/>
+        <w:rPr>
+          <w:rFonts w:ascii="Arial" w:hAnsi="Arial" w:cs="Arial"/>
+          <w:b/>
+          <w:bCs/>
+          <w:color w:val="000000"/>
+          <w:sz w:val="20"/>
+          <w:szCs w:val="20"/>
+        </w:rPr>
+      </w:pPr>
+      <w:r>
+        <w:rPr>
+          <w:rFonts w:ascii="Arial" w:hAnsi="Arial" w:cs="Arial"/>
+          <w:b/>
+          <w:bCs/>
+          <w:color w:val="000000"/>
+          <w:sz w:val="20"/>
+          <w:szCs w:val="20"/>
+        </w:rPr>
+        <w:lastRenderedPageBreak/>
+        <w:t>INDICI</w:t>
+      </w:r>
+    </w:p>
+    <w:p>
+      <w:pPr>
+        <w:pStyle w:val="Titolo3"/>
+        <w:rPr>
+          <w:rFonts w:ascii="Arial" w:hAnsi="Arial" w:cs="Arial"/>
+          <w:color w:val="000000"/>
+          <w:sz w:val="20"/>
+          <w:szCs w:val="20"/>
+        </w:rPr>
+      </w:pPr>
+      <w:r>
+        <w:rPr>
+          <w:rFonts w:ascii="Arial" w:hAnsi="Arial" w:cs="Arial"/>
+          <w:color w:val="000000"/>
+          <w:sz w:val="20"/>
+          <w:szCs w:val="20"/>
+        </w:rPr>
+        <w:t>1. Ottimizzazione delle Query 1 e 3 (Focus: Equi-Join e Indici Hash)</w:t>
+      </w:r>
+    </w:p>
+    <w:p>
+      <w:pPr>
+        <w:pStyle w:val="NormaleWeb"/>
+        <w:rPr>
+          <w:rFonts w:ascii="Arial" w:hAnsi="Arial" w:cs="Arial"/>
+          <w:color w:val="000000"/>
+          <w:sz w:val="20"/>
+          <w:szCs w:val="20"/>
+        </w:rPr>
+      </w:pPr>
+      <w:r>
+        <w:rPr>
+          <w:rFonts w:ascii="Arial" w:hAnsi="Arial" w:cs="Arial"/>
+          <w:color w:val="000000"/>
+          <w:sz w:val="20"/>
+          <w:szCs w:val="20"/>
+        </w:rPr>
+        <w:t>Le</w:t>
+      </w:r>
+      <w:r>
+        <w:rPr>
+          <w:rStyle w:val="apple-converted-space"/>
+          <w:rFonts w:ascii="Arial" w:eastAsiaTheme="majorEastAsia" w:hAnsi="Arial" w:cs="Arial"/>
+          <w:color w:val="000000"/>
+          <w:sz w:val="20"/>
+          <w:szCs w:val="20"/>
+        </w:rPr>
+        <w:t> </w:t>
+      </w:r>
+      <w:r>
+        <w:rPr>
+          <w:rFonts w:ascii="Arial" w:hAnsi="Arial" w:cs="Arial"/>
+          <w:b/>
+          <w:bCs/>
+          <w:color w:val="000000"/>
+          <w:sz w:val="20"/>
+          <w:szCs w:val="20"/>
+        </w:rPr>
+        <w:t>Query 1 e 3</w:t>
+      </w:r>
+      <w:r>
+        <w:rPr>
+          <w:rStyle w:val="apple-converted-space"/>
+          <w:rFonts w:ascii="Arial" w:eastAsiaTheme="majorEastAsia" w:hAnsi="Arial" w:cs="Arial"/>
+          <w:color w:val="000000"/>
+          <w:sz w:val="20"/>
+          <w:szCs w:val="20"/>
+        </w:rPr>
+        <w:t> </w:t>
+      </w:r>
+      <w:r>
+        <w:rPr>
+          <w:rFonts w:ascii="Arial" w:hAnsi="Arial" w:cs="Arial"/>
+          <w:color w:val="000000"/>
+          <w:sz w:val="20"/>
+          <w:szCs w:val="20"/>
+        </w:rPr>
+        <w:t>sono caratterizzate principalmente da operazioni di accoppiamento strutturale tra tabelle (Equi-Join), basate su precise condizioni di uguaglianza</w:t>
+      </w:r>
+      <w:r>
+        <w:rPr>
+          <w:rFonts w:ascii="Arial" w:hAnsi="Arial" w:cs="Arial"/>
+          <w:color w:val="000000"/>
+          <w:sz w:val="20"/>
+          <w:szCs w:val="20"/>
+        </w:rPr>
+        <w:t xml:space="preserve">, </w:t>
+      </w:r>
+      <w:r>
+        <w:rPr>
+          <w:rFonts w:ascii="Arial" w:hAnsi="Arial" w:cs="Arial"/>
+          <w:color w:val="000000"/>
+          <w:sz w:val="20"/>
+          <w:szCs w:val="20"/>
+        </w:rPr>
+        <w:t>come ad esempio</w:t>
+      </w:r>
+      <w:r>
+        <w:rPr>
+          <w:rStyle w:val="apple-converted-space"/>
+          <w:rFonts w:ascii="Arial" w:eastAsiaTheme="majorEastAsia" w:hAnsi="Arial" w:cs="Arial"/>
+          <w:color w:val="000000"/>
+          <w:sz w:val="20"/>
+          <w:szCs w:val="20"/>
+        </w:rPr>
+        <w:t> </w:t>
+      </w:r>
+      <w:proofErr w:type="spellStart"/>
+      <w:r>
+        <w:rPr>
+          <w:rStyle w:val="CodiceHTML"/>
+          <w:rFonts w:ascii="Arial" w:eastAsiaTheme="majorEastAsia" w:hAnsi="Arial" w:cs="Arial"/>
+          <w:color w:val="000000"/>
+        </w:rPr>
+        <w:t>Mazzo.Codice_Mazzo</w:t>
+      </w:r>
+      <w:proofErr w:type="spellEnd"/>
+      <w:r>
+        <w:rPr>
+          <w:rStyle w:val="CodiceHTML"/>
+          <w:rFonts w:ascii="Arial" w:eastAsiaTheme="majorEastAsia" w:hAnsi="Arial" w:cs="Arial"/>
+          <w:color w:val="000000"/>
+        </w:rPr>
+        <w:t xml:space="preserve"> = </w:t>
+      </w:r>
+      <w:proofErr w:type="spellStart"/>
+      <w:r>
+        <w:rPr>
+          <w:rStyle w:val="CodiceHTML"/>
+          <w:rFonts w:ascii="Arial" w:eastAsiaTheme="majorEastAsia" w:hAnsi="Arial" w:cs="Arial"/>
+          <w:color w:val="000000"/>
+        </w:rPr>
+        <w:t>PartOf.Mazzo</w:t>
+      </w:r>
+      <w:proofErr w:type="spellEnd"/>
+      <w:r>
+        <w:rPr>
+          <w:rFonts w:ascii="Arial" w:hAnsi="Arial" w:cs="Arial"/>
+          <w:color w:val="000000"/>
+          <w:sz w:val="20"/>
+          <w:szCs w:val="20"/>
+        </w:rPr>
+        <w:t>.</w:t>
+      </w:r>
+    </w:p>
+    <w:p>
+      <w:pPr>
+        <w:pStyle w:val="NormaleWeb"/>
+        <w:rPr>
+          <w:rFonts w:ascii="Arial" w:hAnsi="Arial" w:cs="Arial"/>
+          <w:color w:val="000000"/>
+          <w:sz w:val="20"/>
+          <w:szCs w:val="20"/>
+        </w:rPr>
+      </w:pPr>
+      <w:r>
+        <w:rPr>
+          <w:rFonts w:ascii="Arial" w:hAnsi="Arial" w:cs="Arial"/>
+          <w:color w:val="000000"/>
+          <w:sz w:val="20"/>
+          <w:szCs w:val="20"/>
+        </w:rPr>
+        <w:t>Per azzerare i tempi di scansione lineare e ottimizzare al massimo questa fase, si prevede l'adozione di indici di tipo</w:t>
+      </w:r>
+      <w:r>
+        <w:rPr>
+          <w:rStyle w:val="apple-converted-space"/>
+          <w:rFonts w:ascii="Arial" w:eastAsiaTheme="majorEastAsia" w:hAnsi="Arial" w:cs="Arial"/>
+          <w:color w:val="000000"/>
+          <w:sz w:val="20"/>
+          <w:szCs w:val="20"/>
+        </w:rPr>
+        <w:t> </w:t>
+      </w:r>
+      <w:proofErr w:type="spellStart"/>
+      <w:r>
+        <w:rPr>
+          <w:rFonts w:ascii="Arial" w:hAnsi="Arial" w:cs="Arial"/>
+          <w:color w:val="000000"/>
+          <w:sz w:val="20"/>
+          <w:szCs w:val="20"/>
+        </w:rPr>
+        <w:t>hash</w:t>
+      </w:r>
+      <w:proofErr w:type="spellEnd"/>
+      <w:r>
+        <w:rPr>
+          <w:rFonts w:ascii="Arial" w:hAnsi="Arial" w:cs="Arial"/>
+          <w:b/>
+          <w:bCs/>
+          <w:color w:val="000000"/>
+          <w:sz w:val="20"/>
+          <w:szCs w:val="20"/>
+        </w:rPr>
+        <w:t xml:space="preserve"> </w:t>
+      </w:r>
+      <w:r>
+        <w:rPr>
+          <w:rFonts w:ascii="Arial" w:hAnsi="Arial" w:cs="Arial"/>
+          <w:color w:val="000000"/>
+          <w:sz w:val="20"/>
+          <w:szCs w:val="20"/>
+        </w:rPr>
+        <w:t>sulle rispettive colonne di giunzione:</w:t>
+      </w:r>
+    </w:p>
+    <w:p>
+      <w:pPr>
+        <w:rPr>
+          <w:rFonts w:ascii="Arial" w:hAnsi="Arial" w:cs="Arial"/>
+          <w:sz w:val="20"/>
+          <w:szCs w:val="20"/>
+        </w:rPr>
+      </w:pPr>
+      <w:r>
+        <w:rPr>
+          <w:rStyle w:val="ng-tns-c621823778-324"/>
+          <w:rFonts w:ascii="Arial" w:eastAsiaTheme="majorEastAsia" w:hAnsi="Arial" w:cs="Arial"/>
+          <w:sz w:val="20"/>
+          <w:szCs w:val="20"/>
+        </w:rPr>
+        <w:t>SQL</w:t>
+      </w:r>
+    </w:p>
+    <w:p>
+      <w:pPr>
+        <w:pStyle w:val="PreformattatoHTML"/>
+        <w:rPr>
+          <w:rStyle w:val="CodiceHTML"/>
+          <w:rFonts w:ascii="Arial" w:eastAsiaTheme="majorEastAsia" w:hAnsi="Arial" w:cs="Arial"/>
+        </w:rPr>
+      </w:pPr>
+      <w:r>
+        <w:rPr>
+          <w:rStyle w:val="hljs-comment"/>
+          <w:rFonts w:ascii="Arial" w:hAnsi="Arial" w:cs="Arial"/>
+        </w:rPr>
+        <w:t>-- Ottimizzazione del Join per le Query 1 e 3</w:t>
+      </w:r>
+    </w:p>
+    <w:p>
+      <w:pPr>
+        <w:pStyle w:val="PreformattatoHTML"/>
+        <w:rPr>
+          <w:rStyle w:val="CodiceHTML"/>
+          <w:rFonts w:ascii="Arial" w:eastAsiaTheme="majorEastAsia" w:hAnsi="Arial" w:cs="Arial"/>
+        </w:rPr>
+      </w:pPr>
+      <w:r>
+        <w:rPr>
+          <w:rStyle w:val="hljs-keyword"/>
+          <w:rFonts w:ascii="Arial" w:eastAsiaTheme="majorEastAsia" w:hAnsi="Arial" w:cs="Arial"/>
+        </w:rPr>
+        <w:t>CREATE</w:t>
+      </w:r>
+      <w:r>
+        <w:rPr>
+          <w:rStyle w:val="CodiceHTML"/>
+          <w:rFonts w:ascii="Arial" w:eastAsiaTheme="majorEastAsia" w:hAnsi="Arial" w:cs="Arial"/>
+        </w:rPr>
+        <w:t xml:space="preserve"> INDEX </w:t>
+      </w:r>
+      <w:proofErr w:type="spellStart"/>
+      <w:r>
+        <w:rPr>
+          <w:rStyle w:val="CodiceHTML"/>
+          <w:rFonts w:ascii="Arial" w:eastAsiaTheme="majorEastAsia" w:hAnsi="Arial" w:cs="Arial"/>
+        </w:rPr>
+        <w:t>idx_partof_hash</w:t>
+      </w:r>
+      <w:proofErr w:type="spellEnd"/>
+      <w:r>
+        <w:rPr>
+          <w:rStyle w:val="CodiceHTML"/>
+          <w:rFonts w:ascii="Arial" w:eastAsiaTheme="majorEastAsia" w:hAnsi="Arial" w:cs="Arial"/>
+        </w:rPr>
+        <w:t xml:space="preserve"> </w:t>
+      </w:r>
+      <w:r>
+        <w:rPr>
+          <w:rStyle w:val="hljs-keyword"/>
+          <w:rFonts w:ascii="Arial" w:eastAsiaTheme="majorEastAsia" w:hAnsi="Arial" w:cs="Arial"/>
+        </w:rPr>
+        <w:t>ON</w:t>
+      </w:r>
+      <w:r>
+        <w:rPr>
+          <w:rStyle w:val="CodiceHTML"/>
+          <w:rFonts w:ascii="Arial" w:eastAsiaTheme="majorEastAsia" w:hAnsi="Arial" w:cs="Arial"/>
+        </w:rPr>
+        <w:t xml:space="preserve"> </w:t>
+      </w:r>
+      <w:proofErr w:type="spellStart"/>
+      <w:r>
+        <w:rPr>
+          <w:rStyle w:val="CodiceHTML"/>
+          <w:rFonts w:ascii="Arial" w:eastAsiaTheme="majorEastAsia" w:hAnsi="Arial" w:cs="Arial"/>
+        </w:rPr>
+        <w:t>PartOf</w:t>
+      </w:r>
+      <w:proofErr w:type="spellEnd"/>
+      <w:r>
+        <w:rPr>
+          <w:rStyle w:val="CodiceHTML"/>
+          <w:rFonts w:ascii="Arial" w:eastAsiaTheme="majorEastAsia" w:hAnsi="Arial" w:cs="Arial"/>
+        </w:rPr>
+        <w:t xml:space="preserve"> </w:t>
+      </w:r>
+      <w:r>
+        <w:rPr>
+          <w:rStyle w:val="hljs-keyword"/>
+          <w:rFonts w:ascii="Arial" w:eastAsiaTheme="majorEastAsia" w:hAnsi="Arial" w:cs="Arial"/>
+        </w:rPr>
+        <w:t>USING</w:t>
+      </w:r>
+      <w:r>
+        <w:rPr>
+          <w:rStyle w:val="CodiceHTML"/>
+          <w:rFonts w:ascii="Arial" w:eastAsiaTheme="majorEastAsia" w:hAnsi="Arial" w:cs="Arial"/>
+        </w:rPr>
+        <w:t xml:space="preserve"> HASH (Mazzo);</w:t>
+      </w:r>
+    </w:p>
+    <w:p>
+      <w:pPr>
+        <w:pStyle w:val="PreformattatoHTML"/>
+        <w:rPr>
+          <w:rStyle w:val="CodiceHTML"/>
+          <w:rFonts w:ascii="Arial" w:eastAsiaTheme="majorEastAsia" w:hAnsi="Arial" w:cs="Arial"/>
+        </w:rPr>
+      </w:pPr>
+      <w:r>
+        <w:rPr>
+          <w:rStyle w:val="hljs-keyword"/>
+          <w:rFonts w:ascii="Arial" w:eastAsiaTheme="majorEastAsia" w:hAnsi="Arial" w:cs="Arial"/>
+        </w:rPr>
+        <w:t>CREATE</w:t>
+      </w:r>
+      <w:r>
+        <w:rPr>
+          <w:rStyle w:val="CodiceHTML"/>
+          <w:rFonts w:ascii="Arial" w:eastAsiaTheme="majorEastAsia" w:hAnsi="Arial" w:cs="Arial"/>
+        </w:rPr>
+        <w:t xml:space="preserve"> INDEX </w:t>
+      </w:r>
+      <w:proofErr w:type="spellStart"/>
+      <w:r>
+        <w:rPr>
+          <w:rStyle w:val="CodiceHTML"/>
+          <w:rFonts w:ascii="Arial" w:eastAsiaTheme="majorEastAsia" w:hAnsi="Arial" w:cs="Arial"/>
+        </w:rPr>
+        <w:t>idx_mazzo_hash</w:t>
+      </w:r>
+      <w:proofErr w:type="spellEnd"/>
+      <w:r>
+        <w:rPr>
+          <w:rStyle w:val="CodiceHTML"/>
+          <w:rFonts w:ascii="Arial" w:eastAsiaTheme="majorEastAsia" w:hAnsi="Arial" w:cs="Arial"/>
+        </w:rPr>
+        <w:t xml:space="preserve"> </w:t>
+      </w:r>
+      <w:r>
+        <w:rPr>
+          <w:rStyle w:val="hljs-keyword"/>
+          <w:rFonts w:ascii="Arial" w:eastAsiaTheme="majorEastAsia" w:hAnsi="Arial" w:cs="Arial"/>
+        </w:rPr>
+        <w:t>ON</w:t>
+      </w:r>
+      <w:r>
+        <w:rPr>
+          <w:rStyle w:val="CodiceHTML"/>
+          <w:rFonts w:ascii="Arial" w:eastAsiaTheme="majorEastAsia" w:hAnsi="Arial" w:cs="Arial"/>
+        </w:rPr>
+        <w:t xml:space="preserve"> Mazzo </w:t>
+      </w:r>
+      <w:r>
+        <w:rPr>
+          <w:rStyle w:val="hljs-keyword"/>
+          <w:rFonts w:ascii="Arial" w:eastAsiaTheme="majorEastAsia" w:hAnsi="Arial" w:cs="Arial"/>
+        </w:rPr>
+        <w:t>USING</w:t>
+      </w:r>
+      <w:r>
+        <w:rPr>
+          <w:rStyle w:val="CodiceHTML"/>
+          <w:rFonts w:ascii="Arial" w:eastAsiaTheme="majorEastAsia" w:hAnsi="Arial" w:cs="Arial"/>
+        </w:rPr>
+        <w:t xml:space="preserve"> HASH (</w:t>
+      </w:r>
+      <w:proofErr w:type="spellStart"/>
+      <w:r>
+        <w:rPr>
+          <w:rStyle w:val="CodiceHTML"/>
+          <w:rFonts w:ascii="Arial" w:eastAsiaTheme="majorEastAsia" w:hAnsi="Arial" w:cs="Arial"/>
+        </w:rPr>
+        <w:t>Codice_Mazzo</w:t>
+      </w:r>
+      <w:proofErr w:type="spellEnd"/>
+      <w:r>
+        <w:rPr>
+          <w:rStyle w:val="CodiceHTML"/>
+          <w:rFonts w:ascii="Arial" w:eastAsiaTheme="majorEastAsia" w:hAnsi="Arial" w:cs="Arial"/>
+        </w:rPr>
+        <w:t>);</w:t>
+      </w:r>
+    </w:p>
+    <w:p>
+      <w:pPr>
+        <w:pStyle w:val="Titolo3"/>
+        <w:rPr>
+          <w:rFonts w:ascii="Arial" w:hAnsi="Arial" w:cs="Arial"/>
+          <w:color w:val="000000"/>
+          <w:sz w:val="20"/>
+          <w:szCs w:val="20"/>
+        </w:rPr>
+      </w:pPr>
+    </w:p>
+    <w:p>
+      <w:pPr>
+        <w:pStyle w:val="Titolo3"/>
+        <w:rPr>
+          <w:rFonts w:ascii="Arial" w:hAnsi="Arial" w:cs="Arial"/>
+          <w:color w:val="000000"/>
+          <w:sz w:val="20"/>
+          <w:szCs w:val="20"/>
+        </w:rPr>
+      </w:pPr>
+      <w:r>
+        <w:rPr>
+          <w:rFonts w:ascii="Arial" w:hAnsi="Arial" w:cs="Arial"/>
+          <w:color w:val="000000"/>
+          <w:sz w:val="20"/>
+          <w:szCs w:val="20"/>
+        </w:rPr>
+        <w:t>2. Ottimizzazione delle Query 2 e 4 (Focus: Raggruppamento, Ordinamento e B+ Tree)</w:t>
+      </w:r>
+    </w:p>
+    <w:p>
+      <w:pPr>
+        <w:pStyle w:val="NormaleWeb"/>
+        <w:rPr>
+          <w:rFonts w:ascii="Arial" w:hAnsi="Arial" w:cs="Arial"/>
+          <w:color w:val="000000"/>
+          <w:sz w:val="20"/>
+          <w:szCs w:val="20"/>
+        </w:rPr>
+      </w:pPr>
+      <w:r>
+        <w:rPr>
+          <w:rFonts w:ascii="Arial" w:hAnsi="Arial" w:cs="Arial"/>
+          <w:color w:val="000000"/>
+          <w:sz w:val="20"/>
+          <w:szCs w:val="20"/>
+        </w:rPr>
+        <w:t>Le</w:t>
+      </w:r>
+      <w:r>
+        <w:rPr>
+          <w:rStyle w:val="apple-converted-space"/>
+          <w:rFonts w:ascii="Arial" w:eastAsiaTheme="majorEastAsia" w:hAnsi="Arial" w:cs="Arial"/>
+          <w:color w:val="000000"/>
+          <w:sz w:val="20"/>
+          <w:szCs w:val="20"/>
+        </w:rPr>
+        <w:t> </w:t>
+      </w:r>
+      <w:r>
+        <w:rPr>
+          <w:rFonts w:ascii="Arial" w:hAnsi="Arial" w:cs="Arial"/>
+          <w:color w:val="000000"/>
+          <w:sz w:val="20"/>
+          <w:szCs w:val="20"/>
+        </w:rPr>
+        <w:t>Query 2 e 4</w:t>
+      </w:r>
+      <w:r>
+        <w:rPr>
+          <w:rStyle w:val="apple-converted-space"/>
+          <w:rFonts w:ascii="Arial" w:eastAsiaTheme="majorEastAsia" w:hAnsi="Arial" w:cs="Arial"/>
+          <w:color w:val="000000"/>
+          <w:sz w:val="20"/>
+          <w:szCs w:val="20"/>
+        </w:rPr>
+        <w:t> </w:t>
+      </w:r>
+      <w:r>
+        <w:rPr>
+          <w:rFonts w:ascii="Arial" w:hAnsi="Arial" w:cs="Arial"/>
+          <w:color w:val="000000"/>
+          <w:sz w:val="20"/>
+          <w:szCs w:val="20"/>
+        </w:rPr>
+        <w:t>si concentrano invece su operazioni di aggregazione dei dati (</w:t>
+      </w:r>
+      <w:r>
+        <w:rPr>
+          <w:rStyle w:val="CodiceHTML"/>
+          <w:rFonts w:ascii="Arial" w:eastAsiaTheme="majorEastAsia" w:hAnsi="Arial" w:cs="Arial"/>
+          <w:color w:val="000000"/>
+        </w:rPr>
+        <w:t>GROUP BY</w:t>
+      </w:r>
+      <w:r>
+        <w:rPr>
+          <w:rFonts w:ascii="Arial" w:hAnsi="Arial" w:cs="Arial"/>
+          <w:color w:val="000000"/>
+          <w:sz w:val="20"/>
+          <w:szCs w:val="20"/>
+        </w:rPr>
+        <w:t>), calcolo di funzioni aggregate (</w:t>
+      </w:r>
+      <w:r>
+        <w:rPr>
+          <w:rStyle w:val="CodiceHTML"/>
+          <w:rFonts w:ascii="Arial" w:eastAsiaTheme="majorEastAsia" w:hAnsi="Arial" w:cs="Arial"/>
+          <w:color w:val="000000"/>
+        </w:rPr>
+        <w:t>SUM</w:t>
+      </w:r>
+      <w:r>
+        <w:rPr>
+          <w:rStyle w:val="apple-converted-space"/>
+          <w:rFonts w:ascii="Arial" w:eastAsiaTheme="majorEastAsia" w:hAnsi="Arial" w:cs="Arial"/>
+          <w:color w:val="000000"/>
+          <w:sz w:val="20"/>
+          <w:szCs w:val="20"/>
+        </w:rPr>
+        <w:t> </w:t>
+      </w:r>
+      <w:r>
+        <w:rPr>
+          <w:rFonts w:ascii="Arial" w:hAnsi="Arial" w:cs="Arial"/>
+          <w:color w:val="000000"/>
+          <w:sz w:val="20"/>
+          <w:szCs w:val="20"/>
+        </w:rPr>
+        <w:t>o</w:t>
+      </w:r>
+      <w:r>
+        <w:rPr>
+          <w:rStyle w:val="apple-converted-space"/>
+          <w:rFonts w:ascii="Arial" w:eastAsiaTheme="majorEastAsia" w:hAnsi="Arial" w:cs="Arial"/>
+          <w:color w:val="000000"/>
+          <w:sz w:val="20"/>
+          <w:szCs w:val="20"/>
+        </w:rPr>
+        <w:t> </w:t>
+      </w:r>
+      <w:r>
+        <w:rPr>
+          <w:rStyle w:val="CodiceHTML"/>
+          <w:rFonts w:ascii="Arial" w:eastAsiaTheme="majorEastAsia" w:hAnsi="Arial" w:cs="Arial"/>
+          <w:color w:val="000000"/>
+        </w:rPr>
+        <w:t>COUNT</w:t>
+      </w:r>
+      <w:r>
+        <w:rPr>
+          <w:rFonts w:ascii="Arial" w:hAnsi="Arial" w:cs="Arial"/>
+          <w:color w:val="000000"/>
+          <w:sz w:val="20"/>
+          <w:szCs w:val="20"/>
+        </w:rPr>
+        <w:t>) ed eventuale ordinamento dei risultati.</w:t>
+      </w:r>
+    </w:p>
+    <w:p>
+      <w:pPr>
+        <w:pStyle w:val="NormaleWeb"/>
+        <w:rPr>
+          <w:rFonts w:ascii="Arial" w:hAnsi="Arial" w:cs="Arial"/>
+          <w:color w:val="000000"/>
+          <w:sz w:val="20"/>
+          <w:szCs w:val="20"/>
+        </w:rPr>
+      </w:pPr>
+      <w:r>
+        <w:rPr>
+          <w:rFonts w:ascii="Arial" w:hAnsi="Arial" w:cs="Arial"/>
+          <w:color w:val="000000"/>
+          <w:sz w:val="20"/>
+          <w:szCs w:val="20"/>
+        </w:rPr>
+        <w:t>Per supportare l'efficienza di queste operazioni, la struttura ideale è l'indice</w:t>
+      </w:r>
+      <w:r>
+        <w:rPr>
+          <w:rStyle w:val="apple-converted-space"/>
+          <w:rFonts w:ascii="Arial" w:eastAsiaTheme="majorEastAsia" w:hAnsi="Arial" w:cs="Arial"/>
+          <w:color w:val="000000"/>
+          <w:sz w:val="20"/>
+          <w:szCs w:val="20"/>
+        </w:rPr>
+        <w:t> </w:t>
+      </w:r>
+      <w:r>
+        <w:rPr>
+          <w:rFonts w:ascii="Arial" w:hAnsi="Arial" w:cs="Arial"/>
+          <w:color w:val="000000"/>
+          <w:sz w:val="20"/>
+          <w:szCs w:val="20"/>
+        </w:rPr>
+        <w:t>B+ Tree</w:t>
+      </w:r>
+      <w:r>
+        <w:rPr>
+          <w:rFonts w:ascii="Arial" w:hAnsi="Arial" w:cs="Arial"/>
+          <w:color w:val="000000"/>
+          <w:sz w:val="20"/>
+          <w:szCs w:val="20"/>
+        </w:rPr>
+        <w:t>. In linea teorica, l'ottimizzazione richiederebbe la creazione di un indice dedicato sulla colonna oggetto del raggruppamento:</w:t>
+      </w:r>
+    </w:p>
+    <w:p>
+      <w:pPr>
+        <w:rPr>
+          <w:rFonts w:ascii="Arial" w:hAnsi="Arial" w:cs="Arial"/>
+          <w:sz w:val="20"/>
+          <w:szCs w:val="20"/>
+        </w:rPr>
+      </w:pPr>
+      <w:r>
+        <w:rPr>
+          <w:rStyle w:val="ng-tns-c621823778-325"/>
+          <w:rFonts w:ascii="Arial" w:hAnsi="Arial" w:cs="Arial"/>
+          <w:sz w:val="20"/>
+          <w:szCs w:val="20"/>
+        </w:rPr>
+        <w:t>SQL</w:t>
+      </w:r>
+    </w:p>
+    <w:p>
+      <w:pPr>
+        <w:pStyle w:val="PreformattatoHTML"/>
+        <w:rPr>
+          <w:rStyle w:val="CodiceHTML"/>
+          <w:rFonts w:ascii="Arial" w:eastAsiaTheme="majorEastAsia" w:hAnsi="Arial" w:cs="Arial"/>
+        </w:rPr>
+      </w:pPr>
+      <w:r>
+        <w:rPr>
+          <w:rStyle w:val="hljs-comment"/>
+          <w:rFonts w:ascii="Arial" w:hAnsi="Arial" w:cs="Arial"/>
+        </w:rPr>
+        <w:t>-- Indice teorico per il raggruppamento nelle Query 2 e 4</w:t>
+      </w:r>
+    </w:p>
+    <w:p>
+      <w:pPr>
+        <w:pStyle w:val="PreformattatoHTML"/>
+        <w:rPr>
+          <w:rStyle w:val="CodiceHTML"/>
+          <w:rFonts w:ascii="Arial" w:eastAsiaTheme="majorEastAsia" w:hAnsi="Arial" w:cs="Arial"/>
+        </w:rPr>
+      </w:pPr>
+      <w:r>
+        <w:rPr>
+          <w:rStyle w:val="hljs-keyword"/>
+          <w:rFonts w:ascii="Arial" w:eastAsiaTheme="majorEastAsia" w:hAnsi="Arial" w:cs="Arial"/>
+        </w:rPr>
+        <w:t>CREATE</w:t>
+      </w:r>
+      <w:r>
+        <w:rPr>
+          <w:rStyle w:val="CodiceHTML"/>
+          <w:rFonts w:ascii="Arial" w:eastAsiaTheme="majorEastAsia" w:hAnsi="Arial" w:cs="Arial"/>
+        </w:rPr>
+        <w:t xml:space="preserve"> INDEX </w:t>
+      </w:r>
+      <w:proofErr w:type="spellStart"/>
+      <w:r>
+        <w:rPr>
+          <w:rStyle w:val="CodiceHTML"/>
+          <w:rFonts w:ascii="Arial" w:eastAsiaTheme="majorEastAsia" w:hAnsi="Arial" w:cs="Arial"/>
+        </w:rPr>
+        <w:t>idx_partof_btree</w:t>
+      </w:r>
+      <w:proofErr w:type="spellEnd"/>
+      <w:r>
+        <w:rPr>
+          <w:rStyle w:val="CodiceHTML"/>
+          <w:rFonts w:ascii="Arial" w:eastAsiaTheme="majorEastAsia" w:hAnsi="Arial" w:cs="Arial"/>
+        </w:rPr>
+        <w:t xml:space="preserve"> </w:t>
+      </w:r>
+      <w:r>
+        <w:rPr>
+          <w:rStyle w:val="hljs-keyword"/>
+          <w:rFonts w:ascii="Arial" w:eastAsiaTheme="majorEastAsia" w:hAnsi="Arial" w:cs="Arial"/>
+        </w:rPr>
+        <w:t>ON</w:t>
+      </w:r>
+      <w:r>
+        <w:rPr>
+          <w:rStyle w:val="CodiceHTML"/>
+          <w:rFonts w:ascii="Arial" w:eastAsiaTheme="majorEastAsia" w:hAnsi="Arial" w:cs="Arial"/>
+        </w:rPr>
+        <w:t xml:space="preserve"> </w:t>
+      </w:r>
+      <w:proofErr w:type="spellStart"/>
+      <w:r>
+        <w:rPr>
+          <w:rStyle w:val="CodiceHTML"/>
+          <w:rFonts w:ascii="Arial" w:eastAsiaTheme="majorEastAsia" w:hAnsi="Arial" w:cs="Arial"/>
+        </w:rPr>
+        <w:t>PartOf</w:t>
+      </w:r>
+      <w:proofErr w:type="spellEnd"/>
+      <w:r>
+        <w:rPr>
+          <w:rStyle w:val="CodiceHTML"/>
+          <w:rFonts w:ascii="Arial" w:eastAsiaTheme="majorEastAsia" w:hAnsi="Arial" w:cs="Arial"/>
+        </w:rPr>
+        <w:t xml:space="preserve"> (Mazzo);</w:t>
+      </w:r>
+    </w:p>
+    <w:p>
+      <w:pPr>
+        <w:pStyle w:val="NormaleWeb"/>
+        <w:rPr>
+          <w:rFonts w:ascii="Arial" w:hAnsi="Arial" w:cs="Arial"/>
+          <w:color w:val="000000"/>
+          <w:sz w:val="20"/>
+          <w:szCs w:val="20"/>
+        </w:rPr>
+      </w:pPr>
+      <w:r>
+        <w:rPr>
+          <w:rFonts w:ascii="Arial" w:hAnsi="Arial" w:cs="Arial"/>
+          <w:b/>
+          <w:bCs/>
+          <w:color w:val="000000"/>
+          <w:sz w:val="20"/>
+          <w:szCs w:val="20"/>
+        </w:rPr>
+        <w:t>Analisi di Ridondanza</w:t>
+      </w:r>
+      <w:r>
+        <w:rPr>
+          <w:rFonts w:ascii="Arial" w:hAnsi="Arial" w:cs="Arial"/>
+          <w:color w:val="000000"/>
+          <w:sz w:val="20"/>
+          <w:szCs w:val="20"/>
+        </w:rPr>
+        <w:t xml:space="preserve">: </w:t>
+      </w:r>
+      <w:r>
+        <w:rPr>
+          <w:rFonts w:ascii="Arial" w:hAnsi="Arial" w:cs="Arial"/>
+          <w:color w:val="000000"/>
+          <w:sz w:val="20"/>
+          <w:szCs w:val="20"/>
+        </w:rPr>
+        <w:t xml:space="preserve">la creazione manuale di questo indice per le Query 2 e 4 non è necessaria. </w:t>
+      </w:r>
+      <w:proofErr w:type="spellStart"/>
+      <w:r>
+        <w:rPr>
+          <w:rFonts w:ascii="Arial" w:hAnsi="Arial" w:cs="Arial"/>
+          <w:color w:val="000000"/>
+          <w:sz w:val="20"/>
+          <w:szCs w:val="20"/>
+        </w:rPr>
+        <w:t>PostgreSQL</w:t>
+      </w:r>
+      <w:proofErr w:type="spellEnd"/>
+      <w:r>
+        <w:rPr>
+          <w:rFonts w:ascii="Arial" w:hAnsi="Arial" w:cs="Arial"/>
+          <w:color w:val="000000"/>
+          <w:sz w:val="20"/>
+          <w:szCs w:val="20"/>
+        </w:rPr>
+        <w:t xml:space="preserve"> genera e mantiene automaticamente un indice B+ Tree per ogni chiave primaria definita nel </w:t>
+      </w:r>
+      <w:r>
+        <w:rPr>
+          <w:rFonts w:ascii="Arial" w:hAnsi="Arial" w:cs="Arial"/>
+          <w:color w:val="000000"/>
+          <w:sz w:val="20"/>
+          <w:szCs w:val="20"/>
+        </w:rPr>
+        <w:t>sistema.</w:t>
+      </w:r>
+    </w:p>
+    <w:p>
+      <w:pPr>
+        <w:pStyle w:val="NormaleWeb"/>
+        <w:rPr>
+          <w:rFonts w:ascii="Arial" w:hAnsi="Arial" w:cs="Arial"/>
+          <w:color w:val="000000"/>
+          <w:sz w:val="20"/>
+          <w:szCs w:val="20"/>
+        </w:rPr>
+      </w:pPr>
+      <w:r>
+        <w:rPr>
+          <w:rFonts w:ascii="Arial" w:hAnsi="Arial" w:cs="Arial"/>
+          <w:color w:val="000000"/>
+          <w:sz w:val="20"/>
+          <w:szCs w:val="20"/>
+        </w:rPr>
+        <w:t>Nel nostro schema, le tabelle presentano già chiavi primarie dedicate (e nel caso di tabelle di giunzione come</w:t>
+      </w:r>
+      <w:r>
+        <w:rPr>
+          <w:rStyle w:val="apple-converted-space"/>
+          <w:rFonts w:ascii="Arial" w:eastAsiaTheme="majorEastAsia" w:hAnsi="Arial" w:cs="Arial"/>
+          <w:color w:val="000000"/>
+          <w:sz w:val="20"/>
+          <w:szCs w:val="20"/>
+        </w:rPr>
+        <w:t> </w:t>
+      </w:r>
+      <w:proofErr w:type="spellStart"/>
+      <w:r>
+        <w:rPr>
+          <w:rStyle w:val="CodiceHTML"/>
+          <w:rFonts w:ascii="Arial" w:eastAsiaTheme="majorEastAsia" w:hAnsi="Arial" w:cs="Arial"/>
+          <w:color w:val="000000"/>
+        </w:rPr>
+        <w:t>PartOf</w:t>
+      </w:r>
+      <w:proofErr w:type="spellEnd"/>
+      <w:r>
+        <w:rPr>
+          <w:rFonts w:ascii="Arial" w:hAnsi="Arial" w:cs="Arial"/>
+          <w:color w:val="000000"/>
+          <w:sz w:val="20"/>
+          <w:szCs w:val="20"/>
+        </w:rPr>
+        <w:t>, una chiave primaria composta</w:t>
+      </w:r>
+      <w:r>
+        <w:rPr>
+          <w:rStyle w:val="apple-converted-space"/>
+          <w:rFonts w:ascii="Arial" w:eastAsiaTheme="majorEastAsia" w:hAnsi="Arial" w:cs="Arial"/>
+          <w:color w:val="000000"/>
+          <w:sz w:val="20"/>
+          <w:szCs w:val="20"/>
+        </w:rPr>
+        <w:t> </w:t>
+      </w:r>
+      <w:r>
+        <w:rPr>
+          <w:rStyle w:val="CodiceHTML"/>
+          <w:rFonts w:ascii="Arial" w:eastAsiaTheme="majorEastAsia" w:hAnsi="Arial" w:cs="Arial"/>
+          <w:color w:val="000000"/>
+        </w:rPr>
+        <w:t>PRIMARY KEY (Mazzo, Carta)</w:t>
+      </w:r>
+      <w:r>
+        <w:rPr>
+          <w:rFonts w:ascii="Arial" w:hAnsi="Arial" w:cs="Arial"/>
+          <w:color w:val="000000"/>
+          <w:sz w:val="20"/>
+          <w:szCs w:val="20"/>
+        </w:rPr>
+        <w:t>). Poiché l'attributo di raggruppamento compare come primo elemento della chiave, l'indice nativo p</w:t>
+      </w:r>
+      <w:r>
+        <w:rPr>
+          <w:rFonts w:ascii="Arial" w:hAnsi="Arial" w:cs="Arial"/>
+          <w:color w:val="000000"/>
+          <w:sz w:val="20"/>
+          <w:szCs w:val="20"/>
+        </w:rPr>
+        <w:t>re</w:t>
+      </w:r>
+      <w:r>
+        <w:rPr>
+          <w:rFonts w:ascii="Arial" w:hAnsi="Arial" w:cs="Arial"/>
+          <w:color w:val="000000"/>
+          <w:sz w:val="20"/>
+          <w:szCs w:val="20"/>
+        </w:rPr>
+        <w:t xml:space="preserve">esistente garantisce già un ordinamento strutturale delle </w:t>
+      </w:r>
+      <w:proofErr w:type="spellStart"/>
+      <w:r>
+        <w:rPr>
+          <w:rFonts w:ascii="Arial" w:hAnsi="Arial" w:cs="Arial"/>
+          <w:color w:val="000000"/>
+          <w:sz w:val="20"/>
+          <w:szCs w:val="20"/>
+        </w:rPr>
+        <w:t>tuple</w:t>
+      </w:r>
+      <w:proofErr w:type="spellEnd"/>
+      <w:r>
+        <w:rPr>
+          <w:rFonts w:ascii="Arial" w:hAnsi="Arial" w:cs="Arial"/>
+          <w:color w:val="000000"/>
+          <w:sz w:val="20"/>
+          <w:szCs w:val="20"/>
+        </w:rPr>
+        <w:t xml:space="preserve"> sul disco. Di conseguenza, per le Query 2 e 4 il database sfrutterà l'indice automatico per eseguire il raggruppamento in memoria in modo sequenziale, risparmiando spazio su disco ed evitando overhead di scrittura.</w:t>
+      </w:r>
+    </w:p>
+    <w:p>
+      <w:pPr>
+        <w:pStyle w:val="Titolo3"/>
+        <w:rPr>
+          <w:rFonts w:ascii="Arial" w:hAnsi="Arial" w:cs="Arial"/>
+          <w:color w:val="000000"/>
+          <w:sz w:val="20"/>
+          <w:szCs w:val="20"/>
+        </w:rPr>
+      </w:pPr>
+      <w:r>
+        <w:rPr>
+          <w:rFonts w:ascii="Arial" w:hAnsi="Arial" w:cs="Arial"/>
+          <w:color w:val="000000"/>
+          <w:sz w:val="20"/>
+          <w:szCs w:val="20"/>
+        </w:rPr>
+        <w:t>3. Valutazione delle Clausole di Filtraggio Finale (HAVING / ORDER BY)</w:t>
+      </w:r>
+    </w:p>
+    <w:p>
+      <w:pPr>
+        <w:pStyle w:val="NormaleWeb"/>
+        <w:rPr>
+          <w:rFonts w:ascii="Arial" w:hAnsi="Arial" w:cs="Arial"/>
+          <w:color w:val="000000"/>
+          <w:sz w:val="20"/>
+          <w:szCs w:val="20"/>
+        </w:rPr>
+      </w:pPr>
+      <w:r>
+        <w:rPr>
+          <w:rFonts w:ascii="Arial" w:hAnsi="Arial" w:cs="Arial"/>
+          <w:color w:val="000000"/>
+          <w:sz w:val="20"/>
+          <w:szCs w:val="20"/>
+        </w:rPr>
+        <w:t xml:space="preserve">Per le query che presentano un filtraggio sui dati aggregati (come la </w:t>
+      </w:r>
+      <w:r>
+        <w:rPr>
+          <w:rFonts w:ascii="Arial" w:hAnsi="Arial" w:cs="Arial"/>
+          <w:color w:val="000000"/>
+          <w:sz w:val="20"/>
+          <w:szCs w:val="20"/>
+        </w:rPr>
+        <w:t>funzione</w:t>
+      </w:r>
+      <w:r>
+        <w:rPr>
+          <w:rStyle w:val="apple-converted-space"/>
+          <w:rFonts w:ascii="Arial" w:eastAsiaTheme="majorEastAsia" w:hAnsi="Arial" w:cs="Arial"/>
+          <w:color w:val="000000"/>
+          <w:sz w:val="20"/>
+          <w:szCs w:val="20"/>
+        </w:rPr>
+        <w:t> </w:t>
+      </w:r>
+      <w:r>
+        <w:rPr>
+          <w:rStyle w:val="CodiceHTML"/>
+          <w:rFonts w:ascii="Arial" w:eastAsiaTheme="majorEastAsia" w:hAnsi="Arial" w:cs="Arial"/>
+          <w:color w:val="000000"/>
+        </w:rPr>
+        <w:t>HAVING</w:t>
+      </w:r>
+      <w:r>
+        <w:rPr>
+          <w:rStyle w:val="apple-converted-space"/>
+          <w:rFonts w:ascii="Arial" w:eastAsiaTheme="majorEastAsia" w:hAnsi="Arial" w:cs="Arial"/>
+          <w:color w:val="000000"/>
+          <w:sz w:val="20"/>
+          <w:szCs w:val="20"/>
+        </w:rPr>
+        <w:t> </w:t>
+      </w:r>
+      <w:r>
+        <w:rPr>
+          <w:rFonts w:ascii="Arial" w:hAnsi="Arial" w:cs="Arial"/>
+          <w:color w:val="000000"/>
+          <w:sz w:val="20"/>
+          <w:szCs w:val="20"/>
+        </w:rPr>
+        <w:t>nella Query 3), si specifica che non è fisicamente possibile applicare un indice diretto su tali costrutti, poiché agiscono su valori calcolati dinamicamente in memoria RAM solo durante l'esecuzione.</w:t>
+      </w:r>
+    </w:p>
+    <w:p>
+      <w:pPr>
+        <w:pStyle w:val="NormaleWeb"/>
+        <w:rPr>
+          <w:rFonts w:ascii="Arial" w:hAnsi="Arial" w:cs="Arial"/>
+          <w:color w:val="000000"/>
+          <w:sz w:val="20"/>
+          <w:szCs w:val="20"/>
+        </w:rPr>
+      </w:pPr>
+      <w:r>
+        <w:rPr>
+          <w:rFonts w:ascii="Arial" w:hAnsi="Arial" w:cs="Arial"/>
+          <w:color w:val="000000"/>
+          <w:sz w:val="20"/>
+          <w:szCs w:val="20"/>
+        </w:rPr>
+        <w:t>Tuttavia, l'intero carico di lavoro risulta</w:t>
+      </w:r>
+      <w:r>
+        <w:rPr>
+          <w:rStyle w:val="apple-converted-space"/>
+          <w:rFonts w:ascii="Arial" w:eastAsiaTheme="majorEastAsia" w:hAnsi="Arial" w:cs="Arial"/>
+          <w:color w:val="000000"/>
+          <w:sz w:val="20"/>
+          <w:szCs w:val="20"/>
+        </w:rPr>
+        <w:t> </w:t>
+      </w:r>
+      <w:r>
+        <w:rPr>
+          <w:rFonts w:ascii="Arial" w:hAnsi="Arial" w:cs="Arial"/>
+          <w:b/>
+          <w:bCs/>
+          <w:color w:val="000000"/>
+          <w:sz w:val="20"/>
+          <w:szCs w:val="20"/>
+        </w:rPr>
+        <w:t>ottimizzato indirettamente</w:t>
+      </w:r>
+      <w:r>
+        <w:rPr>
+          <w:rFonts w:ascii="Arial" w:hAnsi="Arial" w:cs="Arial"/>
+          <w:color w:val="000000"/>
+          <w:sz w:val="20"/>
+          <w:szCs w:val="20"/>
+        </w:rPr>
+        <w:t>:</w:t>
+      </w:r>
+    </w:p>
+    <w:p>
+      <w:pPr>
+        <w:pStyle w:val="NormaleWeb"/>
+        <w:numPr>
+          <w:ilvl w:val="0"/>
+          <w:numId w:val="6"/>
+        </w:numPr>
+        <w:rPr>
+          <w:rFonts w:ascii="Arial" w:hAnsi="Arial" w:cs="Arial"/>
+          <w:color w:val="000000"/>
+          <w:sz w:val="20"/>
+          <w:szCs w:val="20"/>
+        </w:rPr>
+      </w:pPr>
+      <w:r>
+        <w:rPr>
+          <w:rFonts w:ascii="Arial" w:hAnsi="Arial" w:cs="Arial"/>
+          <w:b/>
+          <w:bCs/>
+          <w:color w:val="000000"/>
+          <w:sz w:val="20"/>
+          <w:szCs w:val="20"/>
+        </w:rPr>
+        <w:t>Nelle Query 1 e 3</w:t>
+      </w:r>
+      <w:r>
+        <w:rPr>
+          <w:rFonts w:ascii="Arial" w:hAnsi="Arial" w:cs="Arial"/>
+          <w:color w:val="000000"/>
+          <w:sz w:val="20"/>
+          <w:szCs w:val="20"/>
+        </w:rPr>
+        <w:t>, gli indici Hash riducono a monte il tempo di Join.</w:t>
+      </w:r>
+    </w:p>
+    <w:p>
+      <w:pPr>
+        <w:pStyle w:val="NormaleWeb"/>
+        <w:numPr>
+          <w:ilvl w:val="0"/>
+          <w:numId w:val="6"/>
+        </w:numPr>
+        <w:rPr>
+          <w:rFonts w:ascii="Arial" w:hAnsi="Arial" w:cs="Arial"/>
+          <w:color w:val="000000"/>
+          <w:sz w:val="20"/>
+          <w:szCs w:val="20"/>
+        </w:rPr>
+      </w:pPr>
+      <w:r>
+        <w:rPr>
+          <w:rFonts w:ascii="Arial" w:hAnsi="Arial" w:cs="Arial"/>
+          <w:b/>
+          <w:bCs/>
+          <w:color w:val="000000"/>
+          <w:sz w:val="20"/>
+          <w:szCs w:val="20"/>
+        </w:rPr>
+        <w:t>Nelle Query 2 e 4</w:t>
+      </w:r>
+      <w:r>
+        <w:rPr>
+          <w:rFonts w:ascii="Arial" w:hAnsi="Arial" w:cs="Arial"/>
+          <w:color w:val="000000"/>
+          <w:sz w:val="20"/>
+          <w:szCs w:val="20"/>
+        </w:rPr>
+        <w:t>, gli indici B+ Tree nativi accelerano la fase di Group By.</w:t>
+      </w:r>
+    </w:p>
+    <w:p>
+      <w:pPr>
+        <w:pStyle w:val="NormaleWeb"/>
+        <w:rPr>
+          <w:rFonts w:ascii="Arial" w:hAnsi="Arial" w:cs="Arial"/>
+          <w:color w:val="000000"/>
+          <w:sz w:val="20"/>
+          <w:szCs w:val="20"/>
+        </w:rPr>
+      </w:pPr>
+      <w:r>
+        <w:rPr>
+          <w:rFonts w:ascii="Arial" w:hAnsi="Arial" w:cs="Arial"/>
+          <w:color w:val="000000"/>
+          <w:sz w:val="20"/>
+          <w:szCs w:val="20"/>
+        </w:rPr>
+        <w:t>Grazie a questa combinazione, le clausole di filtraggio e ordinamento finale riceveranno un set di dati già drasticamente ridotto e strutturato, completando l'elaborazione quasi istantaneamente.</w:t>
+      </w:r>
+    </w:p>
+    <w:p>
+      <w:pPr>
+        <w:pStyle w:val="NormaleWeb"/>
+        <w:rPr>
+          <w:rFonts w:ascii="Arial" w:hAnsi="Arial" w:cs="Arial"/>
+          <w:color w:val="000000"/>
+          <w:sz w:val="20"/>
+          <w:szCs w:val="20"/>
+        </w:rPr>
+      </w:pPr>
+    </w:p>
+    <w:p>
+      <w:pPr>
+        <w:spacing w:before="100" w:beforeAutospacing="1" w:after="100" w:afterAutospacing="1"/>
+        <w:rPr>
+          <w:rFonts w:ascii="Arial" w:hAnsi="Arial" w:cs="Arial"/>
+          <w:color w:val="000000"/>
+          <w:sz w:val="20"/>
+          <w:szCs w:val="20"/>
+        </w:rPr>
+      </w:pPr>
+    </w:p>
     <w:sectPr>
       <w:pgSz w:w="11906" w:h="16838"/>
       <w:pgMar w:top="1417" w:right="1134" w:bottom="1134" w:left="1134" w:header="708" w:footer="708" w:gutter="0"/>
@@ -9365,9 +10480,9 @@
 <file path=word/numbering.xml><?xml version="1.0" encoding="utf-8"?>
 <w:numbering xmlns:wpc="http://schemas.microsoft.com/office/word/2010/wordprocessingCanvas" xmlns:cx="http://schemas.microsoft.com/office/drawing/2014/chartex" xmlns:cx1="http://schemas.microsoft.com/office/drawing/2015/9/8/chartex" xmlns:cx2="http://schemas.microsoft.com/office/drawing/2015/10/21/chartex" xmlns:cx3="http://schemas.microsoft.com/office/drawing/2016/5/9/chartex" xmlns:cx4="http://schemas.microsoft.com/office/drawing/2016/5/10/chartex" xmlns:cx5="http://schemas.microsoft.com/office/drawing/2016/5/11/chartex" xmlns:cx6="http://schemas.microsoft.com/office/drawing/2016/5/12/chartex" xmlns:cx7="http://schemas.microsoft.com/office/drawing/2016/5/13/chartex" xmlns:cx8="http://schemas.microsoft.com/office/drawing/2016/5/14/chartex" xmlns:mc="http://schemas.openxmlformats.org/markup-compatibility/2006" xmlns:aink="http://schemas.microsoft.com/office/drawing/2016/ink" xmlns:am3d="http://schemas.microsoft.com/office/drawing/2017/model3d" xmlns:o="urn:schemas-microsoft-com:office:office" xmlns:oel="http://schemas.microsoft.com/office/2019/extlst" xmlns:r="http://schemas.openxmlformats.org/officeDocument/2006/relationships" xmlns:m="http://schemas.openxmlformats.org/officeDocument/2006/math" xmlns:v="urn:schemas-microsoft-com:vml" xmlns:wp14="http://schemas.microsoft.com/office/word/2010/wordprocessingDrawing" xmlns:wp="http://schemas.openxmlformats.org/drawingml/2006/wordprocessingDrawing" xmlns:w10="urn:schemas-microsoft-com:office:word" xmlns:w="http://schemas.openxmlformats.org/wordprocessingml/2006/main" xmlns:w14="http://schemas.microsoft.com/office/word/2010/wordml" xmlns:w15="http://schemas.microsoft.com/office/word/2012/wordml" xmlns:w16cex="http://schemas.microsoft.com/office/word/2018/wordml/cex" xmlns:w16cid="http://schemas.microsoft.com/office/word/2016/wordml/cid" xmlns:w16="http://schemas.microsoft.com/office/word/2018/wordml" xmlns:w16du="http://schemas.microsoft.com/office/word/2023/wordml/word16du" xmlns:w16sdtdh="http://schemas.microsoft.com/office/word/2020/wordml/sdtdatahash" xmlns:w16sdtfl="http://schemas.microsoft.com/office/word/2024/wordml/sdtformatlock" xmlns:w16se="http://schemas.microsoft.com/office/word/2015/wordml/symex" xmlns:wpg="http://schemas.microsoft.com/office/word/2010/wordprocessingGroup" xmlns:wpi="http://schemas.microsoft.com/office/word/2010/wordprocessingInk" xmlns:wne="http://schemas.microsoft.com/office/word/2006/wordml" xmlns:wps="http://schemas.microsoft.com/office/word/2010/wordprocessingShape" mc:Ignorable="w14 w15 w16se w16cid w16 w16cex w16sdtdh w16sdtfl w16du wp14">
   <w:abstractNum w:abstractNumId="0" w15:restartNumberingAfterBreak="0">
-    <w:nsid w:val="19CD7A9A"/>
+    <w:nsid w:val="00C11F0D"/>
     <w:multiLevelType w:val="multilevel"/>
-    <w:tmpl w:val="8CAAC27A"/>
+    <w:tmpl w:val="B92C75C6"/>
     <w:lvl w:ilvl="0">
       <w:start w:val="1"/>
       <w:numFmt w:val="bullet"/>
@@ -9514,9 +10629,9 @@
     </w:lvl>
   </w:abstractNum>
   <w:abstractNum w:abstractNumId="1" w15:restartNumberingAfterBreak="0">
-    <w:nsid w:val="1DA9216A"/>
+    <w:nsid w:val="19CD7A9A"/>
     <w:multiLevelType w:val="multilevel"/>
-    <w:tmpl w:val="40381A18"/>
+    <w:tmpl w:val="8CAAC27A"/>
     <w:lvl w:ilvl="0">
       <w:start w:val="1"/>
       <w:numFmt w:val="bullet"/>
@@ -9663,9 +10778,9 @@
     </w:lvl>
   </w:abstractNum>
   <w:abstractNum w:abstractNumId="2" w15:restartNumberingAfterBreak="0">
-    <w:nsid w:val="55CE067B"/>
+    <w:nsid w:val="1DA9216A"/>
     <w:multiLevelType w:val="multilevel"/>
-    <w:tmpl w:val="3796F008"/>
+    <w:tmpl w:val="40381A18"/>
     <w:lvl w:ilvl="0">
       <w:start w:val="1"/>
       <w:numFmt w:val="bullet"/>
@@ -9812,9 +10927,9 @@
     </w:lvl>
   </w:abstractNum>
   <w:abstractNum w:abstractNumId="3" w15:restartNumberingAfterBreak="0">
-    <w:nsid w:val="7CF92BA6"/>
+    <w:nsid w:val="55CE067B"/>
     <w:multiLevelType w:val="multilevel"/>
-    <w:tmpl w:val="81A04A66"/>
+    <w:tmpl w:val="3796F008"/>
     <w:lvl w:ilvl="0">
       <w:start w:val="1"/>
       <w:numFmt w:val="bullet"/>
@@ -9960,17 +11075,285 @@
       </w:rPr>
     </w:lvl>
   </w:abstractNum>
+  <w:abstractNum w:abstractNumId="4" w15:restartNumberingAfterBreak="0">
+    <w:nsid w:val="786914DF"/>
+    <w:multiLevelType w:val="multilevel"/>
+    <w:tmpl w:val="A40022C6"/>
+    <w:lvl w:ilvl="0">
+      <w:start w:val="1"/>
+      <w:numFmt w:val="decimal"/>
+      <w:lvlText w:val="%1."/>
+      <w:lvlJc w:val="left"/>
+      <w:pPr>
+        <w:tabs>
+          <w:tab w:val="num" w:pos="720"/>
+        </w:tabs>
+        <w:ind w:left="720" w:hanging="360"/>
+      </w:pPr>
+    </w:lvl>
+    <w:lvl w:ilvl="1" w:tentative="1">
+      <w:start w:val="1"/>
+      <w:numFmt w:val="decimal"/>
+      <w:lvlText w:val="%2."/>
+      <w:lvlJc w:val="left"/>
+      <w:pPr>
+        <w:tabs>
+          <w:tab w:val="num" w:pos="1440"/>
+        </w:tabs>
+        <w:ind w:left="1440" w:hanging="360"/>
+      </w:pPr>
+    </w:lvl>
+    <w:lvl w:ilvl="2" w:tentative="1">
+      <w:start w:val="1"/>
+      <w:numFmt w:val="decimal"/>
+      <w:lvlText w:val="%3."/>
+      <w:lvlJc w:val="left"/>
+      <w:pPr>
+        <w:tabs>
+          <w:tab w:val="num" w:pos="2160"/>
+        </w:tabs>
+        <w:ind w:left="2160" w:hanging="360"/>
+      </w:pPr>
+    </w:lvl>
+    <w:lvl w:ilvl="3" w:tentative="1">
+      <w:start w:val="1"/>
+      <w:numFmt w:val="decimal"/>
+      <w:lvlText w:val="%4."/>
+      <w:lvlJc w:val="left"/>
+      <w:pPr>
+        <w:tabs>
+          <w:tab w:val="num" w:pos="2880"/>
+        </w:tabs>
+        <w:ind w:left="2880" w:hanging="360"/>
+      </w:pPr>
+    </w:lvl>
+    <w:lvl w:ilvl="4" w:tentative="1">
+      <w:start w:val="1"/>
+      <w:numFmt w:val="decimal"/>
+      <w:lvlText w:val="%5."/>
+      <w:lvlJc w:val="left"/>
+      <w:pPr>
+        <w:tabs>
+          <w:tab w:val="num" w:pos="3600"/>
+        </w:tabs>
+        <w:ind w:left="3600" w:hanging="360"/>
+      </w:pPr>
+    </w:lvl>
+    <w:lvl w:ilvl="5" w:tentative="1">
+      <w:start w:val="1"/>
+      <w:numFmt w:val="decimal"/>
+      <w:lvlText w:val="%6."/>
+      <w:lvlJc w:val="left"/>
+      <w:pPr>
+        <w:tabs>
+          <w:tab w:val="num" w:pos="4320"/>
+        </w:tabs>
+        <w:ind w:left="4320" w:hanging="360"/>
+      </w:pPr>
+    </w:lvl>
+    <w:lvl w:ilvl="6" w:tentative="1">
+      <w:start w:val="1"/>
+      <w:numFmt w:val="decimal"/>
+      <w:lvlText w:val="%7."/>
+      <w:lvlJc w:val="left"/>
+      <w:pPr>
+        <w:tabs>
+          <w:tab w:val="num" w:pos="5040"/>
+        </w:tabs>
+        <w:ind w:left="5040" w:hanging="360"/>
+      </w:pPr>
+    </w:lvl>
+    <w:lvl w:ilvl="7" w:tentative="1">
+      <w:start w:val="1"/>
+      <w:numFmt w:val="decimal"/>
+      <w:lvlText w:val="%8."/>
+      <w:lvlJc w:val="left"/>
+      <w:pPr>
+        <w:tabs>
+          <w:tab w:val="num" w:pos="5760"/>
+        </w:tabs>
+        <w:ind w:left="5760" w:hanging="360"/>
+      </w:pPr>
+    </w:lvl>
+    <w:lvl w:ilvl="8" w:tentative="1">
+      <w:start w:val="1"/>
+      <w:numFmt w:val="decimal"/>
+      <w:lvlText w:val="%9."/>
+      <w:lvlJc w:val="left"/>
+      <w:pPr>
+        <w:tabs>
+          <w:tab w:val="num" w:pos="6480"/>
+        </w:tabs>
+        <w:ind w:left="6480" w:hanging="360"/>
+      </w:pPr>
+    </w:lvl>
+  </w:abstractNum>
+  <w:abstractNum w:abstractNumId="5" w15:restartNumberingAfterBreak="0">
+    <w:nsid w:val="7CF92BA6"/>
+    <w:multiLevelType w:val="multilevel"/>
+    <w:tmpl w:val="81A04A66"/>
+    <w:lvl w:ilvl="0">
+      <w:start w:val="1"/>
+      <w:numFmt w:val="bullet"/>
+      <w:lvlText w:val=""/>
+      <w:lvlJc w:val="left"/>
+      <w:pPr>
+        <w:tabs>
+          <w:tab w:val="num" w:pos="720"/>
+        </w:tabs>
+        <w:ind w:left="720" w:hanging="360"/>
+      </w:pPr>
+      <w:rPr>
+        <w:rFonts w:ascii="Symbol" w:hAnsi="Symbol" w:hint="default"/>
+        <w:sz w:val="20"/>
+      </w:rPr>
+    </w:lvl>
+    <w:lvl w:ilvl="1" w:tentative="1">
+      <w:start w:val="1"/>
+      <w:numFmt w:val="bullet"/>
+      <w:lvlText w:val="o"/>
+      <w:lvlJc w:val="left"/>
+      <w:pPr>
+        <w:tabs>
+          <w:tab w:val="num" w:pos="1440"/>
+        </w:tabs>
+        <w:ind w:left="1440" w:hanging="360"/>
+      </w:pPr>
+      <w:rPr>
+        <w:rFonts w:ascii="Courier New" w:hAnsi="Courier New" w:hint="default"/>
+        <w:sz w:val="20"/>
+      </w:rPr>
+    </w:lvl>
+    <w:lvl w:ilvl="2" w:tentative="1">
+      <w:start w:val="1"/>
+      <w:numFmt w:val="bullet"/>
+      <w:lvlText w:val=""/>
+      <w:lvlJc w:val="left"/>
+      <w:pPr>
+        <w:tabs>
+          <w:tab w:val="num" w:pos="2160"/>
+        </w:tabs>
+        <w:ind w:left="2160" w:hanging="360"/>
+      </w:pPr>
+      <w:rPr>
+        <w:rFonts w:ascii="Wingdings" w:hAnsi="Wingdings" w:hint="default"/>
+        <w:sz w:val="20"/>
+      </w:rPr>
+    </w:lvl>
+    <w:lvl w:ilvl="3" w:tentative="1">
+      <w:start w:val="1"/>
+      <w:numFmt w:val="bullet"/>
+      <w:lvlText w:val=""/>
+      <w:lvlJc w:val="left"/>
+      <w:pPr>
+        <w:tabs>
+          <w:tab w:val="num" w:pos="2880"/>
+        </w:tabs>
+        <w:ind w:left="2880" w:hanging="360"/>
+      </w:pPr>
+      <w:rPr>
+        <w:rFonts w:ascii="Wingdings" w:hAnsi="Wingdings" w:hint="default"/>
+        <w:sz w:val="20"/>
+      </w:rPr>
+    </w:lvl>
+    <w:lvl w:ilvl="4" w:tentative="1">
+      <w:start w:val="1"/>
+      <w:numFmt w:val="bullet"/>
+      <w:lvlText w:val=""/>
+      <w:lvlJc w:val="left"/>
+      <w:pPr>
+        <w:tabs>
+          <w:tab w:val="num" w:pos="3600"/>
+        </w:tabs>
+        <w:ind w:left="3600" w:hanging="360"/>
+      </w:pPr>
+      <w:rPr>
+        <w:rFonts w:ascii="Wingdings" w:hAnsi="Wingdings" w:hint="default"/>
+        <w:sz w:val="20"/>
+      </w:rPr>
+    </w:lvl>
+    <w:lvl w:ilvl="5" w:tentative="1">
+      <w:start w:val="1"/>
+      <w:numFmt w:val="bullet"/>
+      <w:lvlText w:val=""/>
+      <w:lvlJc w:val="left"/>
+      <w:pPr>
+        <w:tabs>
+          <w:tab w:val="num" w:pos="4320"/>
+        </w:tabs>
+        <w:ind w:left="4320" w:hanging="360"/>
+      </w:pPr>
+      <w:rPr>
+        <w:rFonts w:ascii="Wingdings" w:hAnsi="Wingdings" w:hint="default"/>
+        <w:sz w:val="20"/>
+      </w:rPr>
+    </w:lvl>
+    <w:lvl w:ilvl="6" w:tentative="1">
+      <w:start w:val="1"/>
+      <w:numFmt w:val="bullet"/>
+      <w:lvlText w:val=""/>
+      <w:lvlJc w:val="left"/>
+      <w:pPr>
+        <w:tabs>
+          <w:tab w:val="num" w:pos="5040"/>
+        </w:tabs>
+        <w:ind w:left="5040" w:hanging="360"/>
+      </w:pPr>
+      <w:rPr>
+        <w:rFonts w:ascii="Wingdings" w:hAnsi="Wingdings" w:hint="default"/>
+        <w:sz w:val="20"/>
+      </w:rPr>
+    </w:lvl>
+    <w:lvl w:ilvl="7" w:tentative="1">
+      <w:start w:val="1"/>
+      <w:numFmt w:val="bullet"/>
+      <w:lvlText w:val=""/>
+      <w:lvlJc w:val="left"/>
+      <w:pPr>
+        <w:tabs>
+          <w:tab w:val="num" w:pos="5760"/>
+        </w:tabs>
+        <w:ind w:left="5760" w:hanging="360"/>
+      </w:pPr>
+      <w:rPr>
+        <w:rFonts w:ascii="Wingdings" w:hAnsi="Wingdings" w:hint="default"/>
+        <w:sz w:val="20"/>
+      </w:rPr>
+    </w:lvl>
+    <w:lvl w:ilvl="8" w:tentative="1">
+      <w:start w:val="1"/>
+      <w:numFmt w:val="bullet"/>
+      <w:lvlText w:val=""/>
+      <w:lvlJc w:val="left"/>
+      <w:pPr>
+        <w:tabs>
+          <w:tab w:val="num" w:pos="6480"/>
+        </w:tabs>
+        <w:ind w:left="6480" w:hanging="360"/>
+      </w:pPr>
+      <w:rPr>
+        <w:rFonts w:ascii="Wingdings" w:hAnsi="Wingdings" w:hint="default"/>
+        <w:sz w:val="20"/>
+      </w:rPr>
+    </w:lvl>
+  </w:abstractNum>
   <w:num w:numId="1" w16cid:durableId="1985308245">
+    <w:abstractNumId w:val="3"/>
+  </w:num>
+  <w:num w:numId="2" w16cid:durableId="719982037">
+    <w:abstractNumId w:val="1"/>
+  </w:num>
+  <w:num w:numId="3" w16cid:durableId="1066956342">
     <w:abstractNumId w:val="2"/>
   </w:num>
-  <w:num w:numId="2" w16cid:durableId="719982037">
+  <w:num w:numId="4" w16cid:durableId="1338076087">
+    <w:abstractNumId w:val="5"/>
+  </w:num>
+  <w:num w:numId="5" w16cid:durableId="919027261">
+    <w:abstractNumId w:val="4"/>
+  </w:num>
+  <w:num w:numId="6" w16cid:durableId="1260599023">
     <w:abstractNumId w:val="0"/>
-  </w:num>
-  <w:num w:numId="3" w16cid:durableId="1066956342">
-    <w:abstractNumId w:val="1"/>
-  </w:num>
-  <w:num w:numId="4" w16cid:durableId="1338076087">
-    <w:abstractNumId w:val="3"/>
   </w:num>
 </w:numbering>
 </file>
@@ -11010,12 +12393,101 @@
     <w:name w:val="Normal (Web)"/>
     <w:basedOn w:val="Normale"/>
     <w:uiPriority w:val="99"/>
-    <w:semiHidden/>
     <w:unhideWhenUsed/>
     <w:rsid w:val="004C3302"/>
     <w:pPr>
       <w:spacing w:before="100" w:beforeAutospacing="1" w:after="100" w:afterAutospacing="1"/>
     </w:pPr>
+  </w:style>
+  <w:style w:type="character" w:customStyle="1" w:styleId="ng-tns-c621823778-299">
+    <w:name w:val="ng-tns-c621823778-299"/>
+    <w:basedOn w:val="Carpredefinitoparagrafo"/>
+    <w:rsid w:val="00216211"/>
+  </w:style>
+  <w:style w:type="paragraph" w:styleId="PreformattatoHTML">
+    <w:name w:val="HTML Preformatted"/>
+    <w:basedOn w:val="Normale"/>
+    <w:link w:val="PreformattatoHTMLCarattere"/>
+    <w:uiPriority w:val="99"/>
+    <w:semiHidden/>
+    <w:unhideWhenUsed/>
+    <w:rsid w:val="00216211"/>
+    <w:pPr>
+      <w:tabs>
+        <w:tab w:val="left" w:pos="916"/>
+        <w:tab w:val="left" w:pos="1832"/>
+        <w:tab w:val="left" w:pos="2748"/>
+        <w:tab w:val="left" w:pos="3664"/>
+        <w:tab w:val="left" w:pos="4580"/>
+        <w:tab w:val="left" w:pos="5496"/>
+        <w:tab w:val="left" w:pos="6412"/>
+        <w:tab w:val="left" w:pos="7328"/>
+        <w:tab w:val="left" w:pos="8244"/>
+        <w:tab w:val="left" w:pos="9160"/>
+        <w:tab w:val="left" w:pos="10076"/>
+        <w:tab w:val="left" w:pos="10992"/>
+        <w:tab w:val="left" w:pos="11908"/>
+        <w:tab w:val="left" w:pos="12824"/>
+        <w:tab w:val="left" w:pos="13740"/>
+        <w:tab w:val="left" w:pos="14656"/>
+      </w:tabs>
+    </w:pPr>
+    <w:rPr>
+      <w:rFonts w:ascii="Courier New" w:hAnsi="Courier New" w:cs="Courier New"/>
+      <w:sz w:val="20"/>
+      <w:szCs w:val="20"/>
+    </w:rPr>
+  </w:style>
+  <w:style w:type="character" w:customStyle="1" w:styleId="PreformattatoHTMLCarattere">
+    <w:name w:val="Preformattato HTML Carattere"/>
+    <w:basedOn w:val="Carpredefinitoparagrafo"/>
+    <w:link w:val="PreformattatoHTML"/>
+    <w:uiPriority w:val="99"/>
+    <w:semiHidden/>
+    <w:rsid w:val="00216211"/>
+    <w:rPr>
+      <w:rFonts w:ascii="Courier New" w:eastAsia="Times New Roman" w:hAnsi="Courier New" w:cs="Courier New"/>
+      <w:kern w:val="0"/>
+      <w:sz w:val="20"/>
+      <w:szCs w:val="20"/>
+      <w:lang w:eastAsia="it-IT"/>
+      <w14:ligatures w14:val="none"/>
+    </w:rPr>
+  </w:style>
+  <w:style w:type="character" w:customStyle="1" w:styleId="hljs-keyword">
+    <w:name w:val="hljs-keyword"/>
+    <w:basedOn w:val="Carpredefinitoparagrafo"/>
+    <w:rsid w:val="00216211"/>
+  </w:style>
+  <w:style w:type="character" w:customStyle="1" w:styleId="ng-tns-c621823778-300">
+    <w:name w:val="ng-tns-c621823778-300"/>
+    <w:basedOn w:val="Carpredefinitoparagrafo"/>
+    <w:rsid w:val="00216211"/>
+  </w:style>
+  <w:style w:type="character" w:customStyle="1" w:styleId="ng-tns-c621823778-313">
+    <w:name w:val="ng-tns-c621823778-313"/>
+    <w:basedOn w:val="Carpredefinitoparagrafo"/>
+    <w:rsid w:val="0045026C"/>
+  </w:style>
+  <w:style w:type="character" w:customStyle="1" w:styleId="ng-tns-c621823778-314">
+    <w:name w:val="ng-tns-c621823778-314"/>
+    <w:basedOn w:val="Carpredefinitoparagrafo"/>
+    <w:rsid w:val="0045026C"/>
+  </w:style>
+  <w:style w:type="character" w:customStyle="1" w:styleId="ng-tns-c621823778-324">
+    <w:name w:val="ng-tns-c621823778-324"/>
+    <w:basedOn w:val="Carpredefinitoparagrafo"/>
+    <w:rsid w:val="0045026C"/>
+  </w:style>
+  <w:style w:type="character" w:customStyle="1" w:styleId="hljs-comment">
+    <w:name w:val="hljs-comment"/>
+    <w:basedOn w:val="Carpredefinitoparagrafo"/>
+    <w:rsid w:val="0045026C"/>
+  </w:style>
+  <w:style w:type="character" w:customStyle="1" w:styleId="ng-tns-c621823778-325">
+    <w:name w:val="ng-tns-c621823778-325"/>
+    <w:basedOn w:val="Carpredefinitoparagrafo"/>
+    <w:rsid w:val="0045026C"/>
   </w:style>
 </w:styles>
 </file>

</xml_diff>